<commit_message>
Proofread Chapter 1.5 - Pigeon: spelling, grammar and punctuation fixes
</commit_message>
<xml_diff>
--- a/Chapter 1.5 - Pigeon.docx
+++ b/Chapter 1.5 - Pigeon.docx
@@ -9,12 +9,12 @@
     </w:p>
     <w:p>
       <w:r>
-        <w:t xml:space="preserve">Mrs Petaloudes she was the only other person on his street at that time of day. It was mid-morning. The commuters had gone and the school runs had been done. </w:t>
+        <w:t xml:space="preserve">Mrs Petaloudes was the only other person on his street at that time of day. It was mid-morning. The commuters had gone and the school runs had been done. </w:t>
       </w:r>
     </w:p>
     <w:p>
       <w:r>
-        <w:t xml:space="preserve">That was maybe why Mrs Petaloudes was there on the street at that time of day. Mrs Petaloudes liked to feed the Birds. Ever since he’d lived in the street, he’d seen her around. But he used to see her feeding the birds in the park. She was banned from the park now. </w:t>
+        <w:t xml:space="preserve">That was maybe why Mrs Petaloudes was there on the street at that time of day. Mrs Petaloudes liked to feed the birds. Ever since he’d lived in the street, he’d seen her around. But he used to see her feeding the birds in the park. She was banned from the park now. </w:t>
       </w:r>
     </w:p>
     <w:p>
@@ -30,24 +30,22 @@
         <w:t>s</w:t>
       </w:r>
       <w:r>
-        <w:t xml:space="preserve"> Petlou</w:t>
+        <w:t xml:space="preserve"> Petaloudes</w:t>
+      </w:r>
+      <w:r/>
+      <w:r>
+        <w:t>, along with the man who insisted on turning up pissed and naked at three in the morning and putting cat food through his ex's letter box, and the youths who decided they wanted to play football in the street next to the bloke's house, whose car was so expensive he’d had to broker his own insurance deal on the Lloyds markets. All of these</w:t>
+      </w:r>
+      <w:r>
+        <w:t xml:space="preserve"> terrible</w:t>
+      </w:r>
+      <w:r>
+        <w:t xml:space="preserve"> threats to society had got the same anti-social behaviour orders. So Mrs Petalou</w:t>
       </w:r>
       <w:r>
         <w:t>d</w:t>
       </w:r>
       <w:r>
-        <w:t>es, along with the man who insisted on turning up pissed and naked at three in the morning and putting cat food through his exes letter box, and the youths who decided they wanted to play football in the street next to the blokes house, whose car was so expensive he’d had to broker his own insurance deal on the Lloyds markets. All of these</w:t>
-      </w:r>
-      <w:r>
-        <w:t xml:space="preserve"> terrible</w:t>
-      </w:r>
-      <w:r>
-        <w:t xml:space="preserve"> threats to society had got the same anti-social behaviour orders. So Mrs Petalou</w:t>
-      </w:r>
-      <w:r>
-        <w:t>d</w:t>
-      </w:r>
-      <w:r>
         <w:t>es, actually it was probably her son</w:t>
       </w:r>
       <w:r>
@@ -60,7 +58,7 @@
         <w:t>-</w:t>
       </w:r>
       <w:r>
-        <w:t>law. Yes, she wasn’t alone, she just preferred the company of ducks, homicidal Canadian Geese and pigeons</w:t>
+        <w:t>law. Yes, she wasn’t alone, she just preferred the company of ducks, homicidal Canadian geese and pigeons</w:t>
       </w:r>
       <w:r>
         <w:t xml:space="preserve"> to her own family</w:t>
@@ -69,7 +67,7 @@
         <w:t xml:space="preserve">.  </w:t>
       </w:r>
       <w:r>
-        <w:t xml:space="preserve">And so, it had been mentioned to her that if she fed birds grain in the street, rather than ducks bread in the park, it would require another antisocial behaviour order – the street not having as many bylaws as the park, she might not have as much legal trouble. And by the time the local neighborhood watch got around to that, there’d been a change of government and locking up your neighbours for being mildly annoying had gone out of fashion and destroy our country because our bananas weren’t the right shape was all the rage. </w:t>
+        <w:t xml:space="preserve">And so, it had been mentioned to her that if she fed birds grain in the street, rather than ducks bread in the park, it would require another antisocial behaviour order – the street not having as many bylaws as the park, she might not have as much legal trouble. And by the time the local neighbourhood watch got around to that, there’d been a change of government and locking up your neighbours for being mildly annoying had gone out of fashion and destroying our country because our bananas weren’t the right shape was all the rage. </w:t>
       </w:r>
     </w:p>
     <w:p>
@@ -79,7 +77,7 @@
     </w:p>
     <w:p>
       <w:r>
-        <w:t xml:space="preserve">He was watching his own house. From across the street. He was actually watching it from behind a rhododrendron in the garden of a house that looked like it was abandoned. </w:t>
+        <w:t xml:space="preserve">He was watching his own house. From across the street. He was actually watching it from behind a rhododendron in the garden of a house that looked like it was abandoned. </w:t>
       </w:r>
     </w:p>
     <w:p>
@@ -89,11 +87,10 @@
     </w:p>
     <w:p>
       <w:r>
-        <w:t xml:space="preserve">Mr Petaloudes was followed by a flock of pigeons, enormous seagulls, a few ducks that must have somehow got the message that she had taken her act on the road. She waddled, head down along the pavement, clad entirely in black, black headscarf </w:t>
-      </w:r>
-      <w:r>
-        <w:lastRenderedPageBreak/>
-        <w:t xml:space="preserve">dragging her black shopping cart behind her. She reached a spot on the pavement where there parked cars cleared because there were two driveway next to each other. Here was Klee’s driveway with his boring grey car. And next to it, over a low wall, was the uninsurable supercar. </w:t>
+        <w:t xml:space="preserve">Mrs Petaloudes was followed by a flock of pigeons, enormous seagulls, a few ducks that must have somehow got the message that she had taken her act on the road. She waddled, head down along the pavement, clad entirely in black, black headscarf </w:t>
+      </w:r>
+      <w:r>
+        <w:t xml:space="preserve">dragging her black shopping cart behind her. She reached a spot on the pavement where the parked cars cleared because there were two driveways next to each other. Here was Klee’s driveway with his boring grey car. And next to it, over a low wall, was the uninsurable supercar. </w:t>
       </w:r>
     </w:p>
     <w:p>
@@ -113,7 +110,7 @@
         <w:t xml:space="preserve">e </w:t>
       </w:r>
       <w:r>
-        <w:t>didn’t have to maintain.</w:t>
+        <w:t>didn’t have to maintain it.</w:t>
       </w:r>
     </w:p>
     <w:p>
@@ -133,7 +130,7 @@
         <w:t>Not the</w:t>
       </w:r>
       <w:r>
-        <w:t xml:space="preserve"> Trafalgar square bad boys</w:t>
+        <w:t xml:space="preserve"> Trafalgar Square bad boys</w:t>
       </w:r>
       <w:r>
         <w:t>, their</w:t>
@@ -146,13 +143,13 @@
       </w:r>
       <w:r>
         <w:br/>
-        <w:t>At a particularly tricky point in Klee’s life. Which point hadn’t been tricky? He could hear his wife saying sharply. Well, being suspended, looking like he was going to be fired without his pension, that hadn’t been a great point. At that point, he’d often sat at his kitchen  table and looked out over the garden. And that autumn he’d watched the pigeons. Often</w:t>
+        <w:t>At a particularly tricky point in Klee’s life. Which point hadn’t been tricky? He could hear his wife saying sharply - “Well, being suspended, looking like you were going to be fired without a pension, that wasn’t a high point either.” At that point, he’d often sat at his kitchen table and looked out over the garden. And that autumn he’d watched the pigeons. Often</w:t>
       </w:r>
       <w:r>
         <w:t>,</w:t>
       </w:r>
       <w:r>
-        <w:t xml:space="preserve"> he’d watched them with Jackie, who would could round whenever he got the chance.</w:t>
+        <w:t xml:space="preserve"> he’d watched them with Jackie, who would come round whenever he got the chance.</w:t>
       </w:r>
     </w:p>
     <w:p>
@@ -162,10 +159,10 @@
     </w:p>
     <w:p>
       <w:r>
-        <w:t>Mrs Petaouldes delved deep into her shopping trolley and in a single movement she spread wheat and sweetcorn grains across the bonnet of his car, and his neighbours super car.</w:t>
-      </w:r>
-      <w:r>
-        <w:t xml:space="preserve"> Klee was reminded of this because, as he was watching his house, to figure out if he was being watched, fingering his keys, and wondering if this was stupid and he should just get in the car and drive off. While he was thinking all of this, and watching Mrs Patloudes shower his car bonnet in grain. A large wood pigeon landed on the bonnet of his car.</w:t>
+        <w:t>Mrs Petaloudes delved deep into her shopping trolley and in a single movement she spread wheat and sweetcorn grains across the bonnet of his car, and his neighbours super car.</w:t>
+      </w:r>
+      <w:r>
+        <w:t xml:space="preserve"> Klee was reminded of this because, as he was watching his house, to figure out if he was being watched, fingering his keys, and wondering if this was stupid and he should just get in the car and drive off. While he was thinking all of this, and watching Mrs Petaloudes shower his car bonnet in grain, a large wood pigeon landed on the bonnet of his car.</w:t>
       </w:r>
     </w:p>
     <w:p>

</xml_diff>

<commit_message>
Trying to read the whole thing
</commit_message>
<xml_diff>
--- a/Chapter 1.5 - Pigeon.docx
+++ b/Chapter 1.5 - Pigeon.docx
@@ -14,12 +14,36 @@
     </w:p>
     <w:p>
       <w:r>
-        <w:t xml:space="preserve">That was maybe why Mrs Petaloudes was there on the street at that time of day. Mrs Petaloudes liked to feed the Birds. Ever since he’d lived in the street, he’d seen her around. But he used to see her feeding the birds in the park. She was banned from the park now. </w:t>
-      </w:r>
-    </w:p>
-    <w:p>
-      <w:r>
-        <w:t>What had happened to the attitude to feeding the birds? Somehow, in an age where attitudes to everything seemed to be hardening, the attitude to feeding birds had gone the same way. Especially the attitude to feeding ducks bread. There were even signs now in the park explaining in vivid detail the damage to the gastrointestinal tract of your average mallard that chunk of white sliced could do. The sign might have even included diagrams.</w:t>
+        <w:t>That was maybe why Mrs Petaloudes was there on the stree</w:t>
+      </w:r>
+      <w:r>
+        <w:t>t just then</w:t>
+      </w:r>
+      <w:r>
+        <w:t>.</w:t>
+      </w:r>
+      <w:r>
+        <w:t xml:space="preserve"> She</w:t>
+      </w:r>
+      <w:r>
+        <w:t xml:space="preserve"> liked to feed the Birds. Ever since he’d lived in the street, he’d seen her around. But he used to see her feeding the birds in the park. She was banned from the park now. </w:t>
+      </w:r>
+    </w:p>
+    <w:p>
+      <w:r>
+        <w:t>What had happened to the attitude to feeding the birds? Somehow, in an age where attitudes to everything seemed to be hardening, the attitude to feeding birds had gone the same way. Especially the attitude to feeding bread</w:t>
+      </w:r>
+      <w:r>
+        <w:t xml:space="preserve"> to ducks</w:t>
+      </w:r>
+      <w:r>
+        <w:t xml:space="preserve">. There were even signs now in the park explaining in vivid detail the damage to the gastrointestinal tract of your average mallard that </w:t>
+      </w:r>
+      <w:r>
+        <w:t xml:space="preserve">a </w:t>
+      </w:r>
+      <w:r>
+        <w:t>chunk of white sliced could do. The sign might have even included diagrams.</w:t>
       </w:r>
     </w:p>
     <w:p>
@@ -36,13 +60,67 @@
         <w:t>d</w:t>
       </w:r>
       <w:r>
-        <w:t>es, along with the man who insisted on turning up pissed and naked at three in the morning and putting cat food through his exes letter box, and the youths who decided they wanted to play football in the street next to the blokes house, whose car was so expensive he’d had to broker his own insurance deal on the Lloyds markets. All of these</w:t>
+        <w:t>es</w:t>
+      </w:r>
+      <w:r>
+        <w:t xml:space="preserve"> was grouped</w:t>
+      </w:r>
+      <w:r>
+        <w:t xml:space="preserve"> along with the man who insisted on turning up pissed and naked at three in the morning and putting cat food through his ex</w:t>
+      </w:r>
+      <w:r>
+        <w:t>’</w:t>
+      </w:r>
+      <w:r>
+        <w:t>s letter box</w:t>
+      </w:r>
+      <w:r>
+        <w:t>.</w:t>
+      </w:r>
+      <w:r>
+        <w:t xml:space="preserve"> </w:t>
+      </w:r>
+      <w:r>
+        <w:t>She was in the same metaphorical boat as</w:t>
+      </w:r>
+      <w:r>
+        <w:t xml:space="preserve"> the youths who decided they wanted to play football in the street next to the</w:t>
+      </w:r>
+      <w:r>
+        <w:t xml:space="preserve"> his neighbour’s</w:t>
+      </w:r>
+      <w:r>
+        <w:t xml:space="preserve"> house</w:t>
+      </w:r>
+      <w:r>
+        <w:t>.</w:t>
+      </w:r>
+      <w:r>
+        <w:t xml:space="preserve"> </w:t>
+      </w:r>
+      <w:r>
+        <w:t xml:space="preserve">His neighbour </w:t>
+      </w:r>
+      <w:r>
+        <w:t xml:space="preserve">whose car was so expensive he’d had to broker his own insurance deal on the Lloyds markets. </w:t>
+      </w:r>
+      <w:r>
+        <w:t>The man naked with cat food, the boys playing football and the lady in black who fed the birds, a</w:t>
+      </w:r>
+      <w:r>
+        <w:t>ll of these</w:t>
       </w:r>
       <w:r>
         <w:t xml:space="preserve"> terrible</w:t>
       </w:r>
       <w:r>
-        <w:t xml:space="preserve"> threats to society had got the same anti-social behaviour orders. So Mrs Petalou</w:t>
+        <w:t xml:space="preserve"> threats to society had got the same anti-social behaviour orders.</w:t>
+      </w:r>
+      <w:r>
+        <w:t xml:space="preserve"> Orders telling them to stop it.</w:t>
+      </w:r>
+      <w:r>
+        <w:t xml:space="preserve"> So Mrs Petalou</w:t>
       </w:r>
       <w:r>
         <w:t>d</w:t>
@@ -60,7 +138,13 @@
         <w:t>-</w:t>
       </w:r>
       <w:r>
-        <w:t>law. Yes, she wasn’t alone, she just preferred the company of ducks, homicidal Canadian Geese and pigeons</w:t>
+        <w:t>law</w:t>
+      </w:r>
+      <w:r>
+        <w:t xml:space="preserve"> had stopped feed birds bread in the park</w:t>
+      </w:r>
+      <w:r>
+        <w:t>. Yes, she wasn’t alone, she just preferred the company of ducks, homicidal Canadian Geese and pigeons</w:t>
       </w:r>
       <w:r>
         <w:t xml:space="preserve"> to her own family</w:t>
@@ -69,7 +153,28 @@
         <w:t xml:space="preserve">.  </w:t>
       </w:r>
       <w:r>
-        <w:t xml:space="preserve">And so, it had been mentioned to her that if she fed birds grain in the street, rather than ducks bread in the park, it would require another antisocial behaviour order – the street not having as many bylaws as the park, she might not have as much legal trouble. And by the time the local neighborhood watch got around to that, there’d been a change of government and locking up your neighbours for being mildly annoying had gone out of fashion and destroy our country because our bananas weren’t the right shape was all the rage. </w:t>
+        <w:t>I</w:t>
+      </w:r>
+      <w:r>
+        <w:t>t had been mentioned to her that if she fed birds grain in the street, rather than ducks bread in the park, it would require another</w:t>
+      </w:r>
+      <w:r>
+        <w:t>, different,</w:t>
+      </w:r>
+      <w:r>
+        <w:t xml:space="preserve"> antisocial behaviour order</w:t>
+      </w:r>
+      <w:r>
+        <w:t xml:space="preserve"> to stop her. Because</w:t>
+      </w:r>
+      <w:r>
+        <w:t xml:space="preserve"> the street</w:t>
+      </w:r>
+      <w:r>
+        <w:t>,</w:t>
+      </w:r>
+      <w:r>
+        <w:t xml:space="preserve"> not having as many bylaws as the park, she might not have as much legal trouble. And by the time the local neighborhood watch got around to that, there’d been a change of government and locking up your neighbours for being mildly annoying had gone out of fashion and destroy our country because our bananas weren’t the right shape was all the rage. </w:t>
       </w:r>
     </w:p>
     <w:p>
@@ -89,14 +194,44 @@
     </w:p>
     <w:p>
       <w:r>
-        <w:t xml:space="preserve">Mr Petaloudes was followed by a flock of pigeons, enormous seagulls, a few ducks that must have somehow got the message that she had taken her act on the road. She waddled, head down along the pavement, clad entirely in black, black headscarf </w:t>
-      </w:r>
-      <w:r>
         <w:lastRenderedPageBreak/>
-        <w:t xml:space="preserve">dragging her black shopping cart behind her. She reached a spot on the pavement where there parked cars cleared because there were two driveway next to each other. Here was Klee’s driveway with his boring grey car. And next to it, over a low wall, was the uninsurable supercar. </w:t>
-      </w:r>
-    </w:p>
-    <w:p>
+        <w:t>Mr Petaloudes was followed by a flock of pigeons, enormous seagulls, a few ducks that must have somehow got the message that she had taken her act on the road</w:t>
+      </w:r>
+      <w:r>
+        <w:t xml:space="preserve"> and away from the pond in the park</w:t>
+      </w:r>
+      <w:r>
+        <w:t>. She waddled, head down along the pavement, clad entirely in black</w:t>
+      </w:r>
+      <w:r>
+        <w:t xml:space="preserve"> with a</w:t>
+      </w:r>
+      <w:r>
+        <w:t xml:space="preserve"> black headscarf dragging her black shopping cart behind her. She reached a spot on the pavement where there parked cars cleared because there were two driveway</w:t>
+      </w:r>
+      <w:r>
+        <w:t>s</w:t>
+      </w:r>
+      <w:r>
+        <w:t xml:space="preserve"> next to each other. </w:t>
+      </w:r>
+      <w:r>
+        <w:t>Sitting out on the drive – for the pidgeons to poo on</w:t>
+      </w:r>
+      <w:r>
+        <w:t xml:space="preserve"> -</w:t>
+      </w:r>
+      <w:r>
+        <w:t xml:space="preserve"> was the Pendeli PX 432, the nearly uninsurable supercar.  </w:t>
+      </w:r>
+      <w:r>
+        <w:t>Was Klee’s car – the VBMS – the Very Boring Mid-range Saloon. He always went to his favourite second-hand car dealer, Div Patel. And asked him for the most boring car that he had.</w:t>
+      </w:r>
+    </w:p>
+    <w:p>
+      <w:r>
+        <w:t xml:space="preserve">Klee wished for a moment that he could just go and sit in his kitchen and have a cup of tea. </w:t>
+      </w:r>
       <w:r>
         <w:t>Out the back of Klee’s house was a garden. By some amazing stroke of luck, it was a garden that he could see better than anyone else, but</w:t>
       </w:r>
@@ -146,7 +281,37 @@
       </w:r>
       <w:r>
         <w:br/>
-        <w:t>At a particularly tricky point in Klee’s life. Which point hadn’t been tricky? He could hear his wife saying sharply. Well, being suspended, looking like he was going to be fired without his pension, that hadn’t been a great point. At that point, he’d often sat at his kitchen  table and looked out over the garden. And that autumn he’d watched the pigeons. Often</w:t>
+        <w:t xml:space="preserve">At a particularly tricky point in Klee’s life. </w:t>
+      </w:r>
+      <w:r>
+        <w:t>“</w:t>
+      </w:r>
+      <w:r>
+        <w:t>Which point hadn’t been tricky?</w:t>
+      </w:r>
+      <w:r>
+        <w:t>”</w:t>
+      </w:r>
+      <w:r>
+        <w:t xml:space="preserve"> He could hear his wife saying sharply. Well,</w:t>
+      </w:r>
+      <w:r>
+        <w:t xml:space="preserve"> this point had been when he was</w:t>
+      </w:r>
+      <w:r>
+        <w:t xml:space="preserve"> suspended, looking like he was going to be fired without his pension</w:t>
+      </w:r>
+      <w:r>
+        <w:t>. In a career of points that had been less than marvellous,</w:t>
+      </w:r>
+      <w:r>
+        <w:t xml:space="preserve"> that hadn’t been a great point. At that point, he’d often sat at his kitchen  table and looked out over the garden. And that autumn he’d watched the </w:t>
+      </w:r>
+      <w:r>
+        <w:t xml:space="preserve">wood </w:t>
+      </w:r>
+      <w:r>
+        <w:t>pigeons. Often</w:t>
       </w:r>
       <w:r>
         <w:t>,</w:t>
@@ -159,23 +324,153 @@
       <w:r>
         <w:t>Somebody at a party had asked him once what his soul animal would be, and he’d said “wood pigeon.” Almost without thinking. Maybe it was just the thought of being able to eat enormous amounts without getting any grief for it. He also, for some reason, quite liked the idea of swaying around upside down, eating the cotoneaster berries.</w:t>
       </w:r>
-    </w:p>
-    <w:p>
-      <w:r>
-        <w:t>Mrs Petaouldes delved deep into her shopping trolley and in a single movement she spread wheat and sweetcorn grains across the bonnet of his car, and his neighbours super car.</w:t>
-      </w:r>
-      <w:r>
-        <w:t xml:space="preserve"> Klee was reminded of this because, as he was watching his house, to figure out if he was being watched, fingering his keys, and wondering if this was stupid and he should just get in the car and drive off. While he was thinking all of this, and watching Mrs Patloudes shower his car bonnet in grain. A large wood pigeon landed on the bonnet of his car.</w:t>
-      </w:r>
-    </w:p>
-    <w:p>
-      <w:r>
+      <w:r>
+        <w:t xml:space="preserve"> The reason he was thinking about this now was that there were also wood pigeons in Mrs Petaloudes retinue.</w:t>
+      </w:r>
+    </w:p>
+    <w:p>
+      <w:r>
+        <w:t xml:space="preserve">Mrs Petaouldes delved deep into her shopping trolley and in a single movement she spread wheat and </w:t>
+      </w:r>
+      <w:r>
+        <w:t xml:space="preserve">dried </w:t>
+      </w:r>
+      <w:r>
+        <w:t>sweetcorn grains across the bonnet of his car, and his neighbour</w:t>
+      </w:r>
+      <w:r>
+        <w:t>’</w:t>
+      </w:r>
+      <w:r>
+        <w:t>s super car.</w:t>
+      </w:r>
+      <w:r>
+        <w:t xml:space="preserve"> Klee was reminded of this because, as he was watching his house, to figure out if he was being watched, fingering his keys, and wondering if this was stupid and he should just get in the car and drive off. While he was thinking all of this, and watching Mrs P</w:t>
+      </w:r>
+      <w:r>
+        <w:t>e</w:t>
+      </w:r>
+      <w:r>
+        <w:t>t</w:t>
+      </w:r>
+      <w:r>
+        <w:t>a</w:t>
+      </w:r>
+      <w:r>
+        <w:t>loudes shower his car bonnet in grain. A large wood pigeon landed on the bonnet of his car.</w:t>
+      </w:r>
+    </w:p>
+    <w:p>
+      <w:r>
+        <w:lastRenderedPageBreak/>
         <w:t>And then his car exploded.</w:t>
       </w:r>
     </w:p>
     <w:p>
       <w:r>
         <w:t xml:space="preserve"> </w:t>
+      </w:r>
+      <w:r>
+        <w:t>----------------</w:t>
+      </w:r>
+    </w:p>
+    <w:p>
+      <w:r>
+        <w:t xml:space="preserve">This was </w:t>
+      </w:r>
+      <w:r>
+        <w:t xml:space="preserve">a </w:t>
+      </w:r>
+      <w:r>
+        <w:t xml:space="preserve">big bomb. </w:t>
+      </w:r>
+      <w:r>
+        <w:t>And it had bewildering</w:t>
+      </w:r>
+      <w:r>
+        <w:t>ly condradictory</w:t>
+      </w:r>
+      <w:r>
+        <w:t xml:space="preserve"> effects. For Mrs Petaloudes, the effect was like she’d been, not so much fired out of a cannon, but bowled, like a bowling ball across the road.</w:t>
+      </w:r>
+      <w:r>
+        <w:t xml:space="preserve"> Leaving her sitting facing away from the explosion in the gutter.</w:t>
+      </w:r>
+      <w:r>
+        <w:t xml:space="preserve"> The effect for Klee, who had been further away was to suck him in</w:t>
+      </w:r>
+      <w:r>
+        <w:t xml:space="preserve"> towards the blast</w:t>
+      </w:r>
+      <w:r>
+        <w:t>, pulling him through the rhododendron bush that he was hiding behind and leaving him on the pavement next to her.</w:t>
+      </w:r>
+    </w:p>
+    <w:p>
+      <w:r>
+        <w:t>Klee had never said much to her, before, perhaps the odd “hello.”</w:t>
+      </w:r>
+    </w:p>
+    <w:p>
+      <w:r>
+        <w:t>He could see that she was still conscious, and blinking. She didn’t look like she was too badly hurt?</w:t>
+      </w:r>
+      <w:r>
+        <w:br/>
+        <w:t>“Are you alright? Mrs Petaloudes?”</w:t>
+      </w:r>
+      <w:r>
+        <w:br/>
+        <w:t>“I’m allowed to feed them here. There’s nothing you can do copper!”</w:t>
+      </w:r>
+      <w:r>
+        <w:br/>
+        <w:t xml:space="preserve">How did she know he was a policeman, he supposed everybody probably made it their business to know if their neighbour was a policeman. </w:t>
+      </w:r>
+    </w:p>
+    <w:p>
+      <w:r>
+        <w:t>“I’m not a police office anymore Mrs Petaloudes.”</w:t>
+      </w:r>
+    </w:p>
+    <w:p>
+      <w:r>
+        <w:t>“Well, then leave me alone!”</w:t>
+      </w:r>
+    </w:p>
+    <w:p>
+      <w:r>
+        <w:t>He realized he’d put a hand on her shoulder. She shook him off and he noticed</w:t>
+      </w:r>
+      <w:r>
+        <w:t>,</w:t>
+      </w:r>
+      <w:r>
+        <w:t xml:space="preserve"> to his surprise, that she didn’t feel weak or frail, but actually quite solid.</w:t>
+      </w:r>
+      <w:r>
+        <w:t xml:space="preserve"> Once again, he wondered how old she was. But looking her directly in the face always seemed to be a struggle. He caught just a glance of her pale brown eyes. Before she was off.</w:t>
+      </w:r>
+    </w:p>
+    <w:p>
+      <w:pPr>
+        <w:pBdr>
+          <w:bottom w:val="single" w:sz="6" w:space="1" w:color="auto"/>
+        </w:pBdr>
+      </w:pPr>
+      <w:r>
+        <w:t>She didn’t struggle to her feet, so much as she sprang to them. Walking back into the middle of the road where her shopping trolley had been left by the blast had spilled it’s contents in a broad slick.</w:t>
+      </w:r>
+      <w:r>
+        <w:t xml:space="preserve"> Surveying the grains for a moment and then and then deciding, obviously, not to try to pick them up.</w:t>
+      </w:r>
+    </w:p>
+    <w:p>
+      <w:r>
+        <w:t xml:space="preserve">When they’d bought the house, one of the things that the estate agent had made much of, was the off-street parking. </w:t>
+      </w:r>
+      <w:r>
+        <w:t>The patch of gravel in front of the house. Klee could now see that the bomb had turned this off-street parking into on-roof parking – he could see at least one wheel up there. It had also managed to put the engine block of his grey-blue mid-range saloon on the bonnet of his neighbour’s car.</w:t>
       </w:r>
     </w:p>
     <w:sectPr>

</xml_diff>

<commit_message>
Working through the chapters
</commit_message>
<xml_diff>
--- a/Chapter 1.5 - Pigeon.docx
+++ b/Chapter 1.5 - Pigeon.docx
@@ -1,6 +1,6 @@
 
 <file path=word/document.xml><?xml version="1.0" encoding="utf-8"?>
-<w:document xmlns:wpc="http://schemas.microsoft.com/office/word/2010/wordprocessingCanvas" xmlns:cx="http://schemas.microsoft.com/office/drawing/2014/chartex" xmlns:cx1="http://schemas.microsoft.com/office/drawing/2015/9/8/chartex" xmlns:cx2="http://schemas.microsoft.com/office/drawing/2015/10/21/chartex" xmlns:cx3="http://schemas.microsoft.com/office/drawing/2016/5/9/chartex" xmlns:cx4="http://schemas.microsoft.com/office/drawing/2016/5/10/chartex" xmlns:cx5="http://schemas.microsoft.com/office/drawing/2016/5/11/chartex" xmlns:cx6="http://schemas.microsoft.com/office/drawing/2016/5/12/chartex" xmlns:cx7="http://schemas.microsoft.com/office/drawing/2016/5/13/chartex" xmlns:cx8="http://schemas.microsoft.com/office/drawing/2016/5/14/chartex" xmlns:mc="http://schemas.openxmlformats.org/markup-compatibility/2006" xmlns:aink="http://schemas.microsoft.com/office/drawing/2016/ink" xmlns:am3d="http://schemas.microsoft.com/office/drawing/2017/model3d" xmlns:o="urn:schemas-microsoft-com:office:office" xmlns:oel="http://schemas.microsoft.com/office/2019/extlst" xmlns:r="http://schemas.openxmlformats.org/officeDocument/2006/relationships" xmlns:m="http://schemas.openxmlformats.org/officeDocument/2006/math" xmlns:v="urn:schemas-microsoft-com:vml" xmlns:wp14="http://schemas.microsoft.com/office/word/2010/wordprocessingDrawing" xmlns:wp="http://schemas.openxmlformats.org/drawingml/2006/wordprocessingDrawing" xmlns:w10="urn:schemas-microsoft-com:office:word" xmlns:w="http://schemas.openxmlformats.org/wordprocessingml/2006/main" xmlns:w14="http://schemas.microsoft.com/office/word/2010/wordml" xmlns:w15="http://schemas.microsoft.com/office/word/2012/wordml" xmlns:w16cex="http://schemas.microsoft.com/office/word/2018/wordml/cex" xmlns:w16cid="http://schemas.microsoft.com/office/word/2016/wordml/cid" xmlns:w16="http://schemas.microsoft.com/office/word/2018/wordml" xmlns:w16du="http://schemas.microsoft.com/office/word/2023/wordml/word16du" xmlns:w16sdtdh="http://schemas.microsoft.com/office/word/2020/wordml/sdtdatahash" xmlns:w16sdtfl="http://schemas.microsoft.com/office/word/2024/wordml/sdtformatlock" xmlns:w16se="http://schemas.microsoft.com/office/word/2015/wordml/symex" xmlns:wpg="http://schemas.microsoft.com/office/word/2010/wordprocessingGroup" xmlns:wpi="http://schemas.microsoft.com/office/word/2010/wordprocessingInk" xmlns:wne="http://schemas.microsoft.com/office/word/2006/wordml" xmlns:wps="http://schemas.microsoft.com/office/word/2010/wordprocessingShape" mc:Ignorable="w14 w15 w16se w16cid w16 w16cex w16sdtdh w16sdtfl w16du wp14">
+<w:document xmlns:wpc="http://schemas.microsoft.com/office/word/2010/wordprocessingCanvas" xmlns:cx="http://schemas.microsoft.com/office/drawing/2014/chartex" xmlns:cx1="http://schemas.microsoft.com/office/drawing/2015/9/8/chartex" xmlns:cx2="http://schemas.microsoft.com/office/drawing/2015/10/21/chartex" xmlns:cx3="http://schemas.microsoft.com/office/drawing/2016/5/9/chartex" xmlns:cx4="http://schemas.microsoft.com/office/drawing/2016/5/10/chartex" xmlns:cx5="http://schemas.microsoft.com/office/drawing/2016/5/11/chartex" xmlns:cx6="http://schemas.microsoft.com/office/drawing/2016/5/12/chartex" xmlns:cx7="http://schemas.microsoft.com/office/drawing/2016/5/13/chartex" xmlns:cx8="http://schemas.microsoft.com/office/drawing/2016/5/14/chartex" xmlns:mc="http://schemas.openxmlformats.org/markup-compatibility/2006" xmlns:aink="http://schemas.microsoft.com/office/drawing/2016/ink" xmlns:am3d="http://schemas.microsoft.com/office/drawing/2017/model3d" xmlns:o="urn:schemas-microsoft-com:office:office" xmlns:oel="http://schemas.microsoft.com/office/2019/extlst" xmlns:r="http://schemas.openxmlformats.org/officeDocument/2006/relationships" xmlns:m="http://schemas.openxmlformats.org/officeDocument/2006/math" xmlns:v="urn:schemas-microsoft-com:vml" xmlns:wp14="http://schemas.microsoft.com/office/word/2010/wordprocessingDrawing" xmlns:wp="http://schemas.openxmlformats.org/drawingml/2006/wordprocessingDrawing" xmlns:w10="urn:schemas-microsoft-com:office:word" xmlns:w="http://schemas.openxmlformats.org/wordprocessingml/2006/main" xmlns:w14="http://schemas.microsoft.com/office/word/2010/wordml" xmlns:w15="http://schemas.microsoft.com/office/word/2012/wordml" xmlns:w16cei="http://schemas.microsoft.com/office/word/2026/wordml/cei" xmlns:w16cex="http://schemas.microsoft.com/office/word/2018/wordml/cex" xmlns:w16cid="http://schemas.microsoft.com/office/word/2016/wordml/cid" xmlns:w16="http://schemas.microsoft.com/office/word/2018/wordml" xmlns:w16du="http://schemas.microsoft.com/office/word/2023/wordml/word16du" xmlns:w16sdtdh="http://schemas.microsoft.com/office/word/2020/wordml/sdtdatahash" xmlns:w16sdtfl="http://schemas.microsoft.com/office/word/2024/wordml/sdtformatlock" xmlns:w16se="http://schemas.microsoft.com/office/word/2015/wordml/symex" xmlns:wpg="http://schemas.microsoft.com/office/word/2010/wordprocessingGroup" xmlns:wpi="http://schemas.microsoft.com/office/word/2010/wordprocessingInk" xmlns:wne="http://schemas.microsoft.com/office/word/2006/wordml" xmlns:wps="http://schemas.microsoft.com/office/word/2010/wordprocessingShape" mc:Ignorable="w14 w15 w16se w16cid w16 w16cex w16sdtdh w16sdtfl w16du wp14">
   <w:body>
     <w:p>
       <w:r>
@@ -8,22 +8,38 @@
       </w:r>
     </w:p>
     <w:p>
-      <w:r>
-        <w:t>Mrs Petaloudes</w:t>
+      <w:proofErr w:type="spellStart"/>
+      <w:r>
+        <w:t>Mrs</w:t>
+      </w:r>
+      <w:proofErr w:type="spellEnd"/>
+      <w:r>
+        <w:t xml:space="preserve"> Petaloudes</w:t>
       </w:r>
       <w:r>
         <w:t>,</w:t>
       </w:r>
       <w:r>
-        <w:t xml:space="preserve"> she</w:t>
-      </w:r>
-      <w:r>
-        <w:t xml:space="preserve"> was the only other person on his street at that time of day. It was mid-morning. The commuters had gone and the school runs had been done. </w:t>
-      </w:r>
-    </w:p>
-    <w:p>
-      <w:r>
-        <w:t>That was maybe why Mrs Petaloudes was there on the street</w:t>
+        <w:t xml:space="preserve"> she was the only other person on his street at that time of day. It was mid-morning. The commuters had gone and the school runs had been done. </w:t>
+      </w:r>
+    </w:p>
+    <w:p>
+      <w:r>
+        <w:t xml:space="preserve">That was maybe why </w:t>
+      </w:r>
+      <w:proofErr w:type="spellStart"/>
+      <w:r>
+        <w:t>Mrs</w:t>
+      </w:r>
+      <w:proofErr w:type="spellEnd"/>
+      <w:r>
+        <w:t xml:space="preserve"> Petaloud</w:t>
+      </w:r>
+      <w:r>
+        <w:t>i</w:t>
+      </w:r>
+      <w:r>
+        <w:t>s was there on the street</w:t>
       </w:r>
       <w:r>
         <w:t xml:space="preserve"> at that time</w:t>
@@ -41,10 +57,7 @@
         <w:t>b</w:t>
       </w:r>
       <w:r>
-        <w:t>irds</w:t>
-      </w:r>
-      <w:r>
-        <w:t xml:space="preserve">. Ever since he’d lived in the street, he’d seen her around. But he used to see her feeding the birds in the park. She was banned from the park now. </w:t>
+        <w:t xml:space="preserve">irds. Ever since he’d lived in the street, he’d seen her around. But he used to see her feeding the birds in the park. She was banned from the park now. </w:t>
       </w:r>
     </w:p>
     <w:p>
@@ -66,380 +79,717 @@
     </w:p>
     <w:p>
       <w:r>
-        <w:t>Anyway, the result of all this raised awareness was that Mr</w:t>
+        <w:t xml:space="preserve">Anyway, the result of all this raised awareness was that </w:t>
+      </w:r>
+      <w:proofErr w:type="spellStart"/>
+      <w:r>
+        <w:t>Mr</w:t>
       </w:r>
       <w:r>
         <w:t>s</w:t>
       </w:r>
+      <w:proofErr w:type="spellEnd"/>
+      <w:r>
+        <w:t xml:space="preserve"> Petlou</w:t>
+      </w:r>
+      <w:r>
+        <w:t>d</w:t>
+      </w:r>
+      <w:r>
+        <w:t>i</w:t>
+      </w:r>
+      <w:r>
+        <w:t>s</w:t>
+      </w:r>
+      <w:r>
+        <w:t xml:space="preserve"> was grouped</w:t>
+      </w:r>
+      <w:r>
+        <w:t xml:space="preserve"> along with the man who insisted on turning up</w:t>
+      </w:r>
+      <w:r>
+        <w:t xml:space="preserve"> on his ex’s lawn</w:t>
+      </w:r>
+      <w:r>
+        <w:t xml:space="preserve"> pissed and naked at three in the morning and putting cat food through </w:t>
+      </w:r>
+      <w:r>
+        <w:t xml:space="preserve">her </w:t>
+      </w:r>
+      <w:r>
+        <w:t>letter box</w:t>
+      </w:r>
+      <w:r>
+        <w:t>.</w:t>
+      </w:r>
       <w:r>
         <w:t xml:space="preserve"> </w:t>
       </w:r>
       <w:r>
-        <w:t>Petlou</w:t>
+        <w:t>She was in the same metaphorical</w:t>
+      </w:r>
+      <w:r>
+        <w:t>, legal.</w:t>
+      </w:r>
+      <w:r>
+        <w:t xml:space="preserve"> boat as</w:t>
+      </w:r>
+      <w:r>
+        <w:t xml:space="preserve"> the youths who decided they wanted to play football in the street next to </w:t>
+      </w:r>
+      <w:r>
+        <w:t xml:space="preserve">his </w:t>
+      </w:r>
+      <w:proofErr w:type="spellStart"/>
+      <w:r>
+        <w:t>neighbour’s</w:t>
+      </w:r>
+      <w:proofErr w:type="spellEnd"/>
+      <w:r>
+        <w:t xml:space="preserve"> house</w:t>
+      </w:r>
+      <w:r>
+        <w:t>.</w:t>
+      </w:r>
+      <w:r>
+        <w:t xml:space="preserve"> </w:t>
+      </w:r>
+      <w:proofErr w:type="spellStart"/>
+      <w:r>
+        <w:t>Boungcing</w:t>
+      </w:r>
+      <w:proofErr w:type="spellEnd"/>
+      <w:r>
+        <w:t xml:space="preserve"> their ball of the bonnet </w:t>
+      </w:r>
+      <w:proofErr w:type="spellStart"/>
+      <w:r>
+        <w:t>neighbour</w:t>
+      </w:r>
+      <w:r>
+        <w:t>’s</w:t>
+      </w:r>
+      <w:proofErr w:type="spellEnd"/>
+      <w:r>
+        <w:t xml:space="preserve"> car</w:t>
+      </w:r>
+      <w:r>
+        <w:t xml:space="preserve">. </w:t>
+      </w:r>
+      <w:proofErr w:type="gramStart"/>
+      <w:r>
+        <w:t>A  car</w:t>
+      </w:r>
+      <w:proofErr w:type="gramEnd"/>
+      <w:r>
+        <w:t xml:space="preserve"> so expensive he’d had to broker his own insurance deal on the Lloyd</w:t>
+      </w:r>
+      <w:r>
+        <w:t>’</w:t>
+      </w:r>
+      <w:r>
+        <w:t xml:space="preserve">s markets. </w:t>
+      </w:r>
+      <w:r>
+        <w:t xml:space="preserve">The man naked with cat food, the boys playing football and the lady in black who fed the birds, </w:t>
+      </w:r>
+      <w:proofErr w:type="gramStart"/>
+      <w:r>
+        <w:t>a</w:t>
+      </w:r>
+      <w:r>
+        <w:t>ll of</w:t>
+      </w:r>
+      <w:proofErr w:type="gramEnd"/>
+      <w:r>
+        <w:t xml:space="preserve"> these</w:t>
+      </w:r>
+      <w:r>
+        <w:t xml:space="preserve"> terrible</w:t>
+      </w:r>
+      <w:r>
+        <w:t xml:space="preserve"> threats to society </w:t>
+      </w:r>
+      <w:r>
+        <w:t xml:space="preserve">had been reined in with </w:t>
+      </w:r>
+      <w:r>
+        <w:t xml:space="preserve">anti-social </w:t>
+      </w:r>
+      <w:proofErr w:type="spellStart"/>
+      <w:r>
+        <w:t>behaviour</w:t>
+      </w:r>
+      <w:proofErr w:type="spellEnd"/>
+      <w:r>
+        <w:t xml:space="preserve"> orders. </w:t>
+      </w:r>
+      <w:r>
+        <w:t>Orders telling them to</w:t>
+      </w:r>
+      <w:r>
+        <w:t xml:space="preserve">, well, </w:t>
+      </w:r>
+      <w:r>
+        <w:t>stop it</w:t>
+      </w:r>
+      <w:r>
+        <w:t>, essentially</w:t>
+      </w:r>
+      <w:r>
+        <w:t>.</w:t>
+      </w:r>
+      <w:r>
+        <w:t xml:space="preserve"> </w:t>
+      </w:r>
+    </w:p>
+    <w:p>
+      <w:r>
+        <w:t xml:space="preserve">So </w:t>
+      </w:r>
+      <w:proofErr w:type="spellStart"/>
+      <w:r>
+        <w:t>Mrs</w:t>
+      </w:r>
+      <w:proofErr w:type="spellEnd"/>
+      <w:r>
+        <w:t xml:space="preserve"> Petalou</w:t>
       </w:r>
       <w:r>
         <w:t>d</w:t>
       </w:r>
       <w:r>
-        <w:t>es</w:t>
-      </w:r>
-      <w:r>
-        <w:t xml:space="preserve"> was grouped</w:t>
-      </w:r>
-      <w:r>
-        <w:t xml:space="preserve"> along with the man who insisted on turning up pissed and naked at three in the morning and putting cat food through his </w:t>
-      </w:r>
-      <w:r>
-        <w:t>ex</w:t>
-      </w:r>
-      <w:r>
-        <w:t>’</w:t>
+        <w:t xml:space="preserve">es, </w:t>
+      </w:r>
+      <w:proofErr w:type="gramStart"/>
+      <w:r>
+        <w:t>actually it</w:t>
+      </w:r>
+      <w:proofErr w:type="gramEnd"/>
+      <w:r>
+        <w:t xml:space="preserve"> was probably her son</w:t>
+      </w:r>
+      <w:r>
+        <w:t>-</w:t>
+      </w:r>
+      <w:r>
+        <w:t>in</w:t>
+      </w:r>
+      <w:r>
+        <w:t>-</w:t>
+      </w:r>
+      <w:proofErr w:type="gramStart"/>
+      <w:r>
+        <w:t>law</w:t>
+      </w:r>
+      <w:proofErr w:type="gramEnd"/>
+      <w:r>
+        <w:t xml:space="preserve"> had stopped</w:t>
+      </w:r>
+      <w:r>
+        <w:t xml:space="preserve"> her</w:t>
+      </w:r>
+      <w:r>
+        <w:t xml:space="preserve"> feed</w:t>
+      </w:r>
+      <w:r>
+        <w:t>ing</w:t>
+      </w:r>
+      <w:r>
+        <w:t xml:space="preserve"> </w:t>
+      </w:r>
+      <w:proofErr w:type="gramStart"/>
+      <w:r>
+        <w:t>birds</w:t>
+      </w:r>
+      <w:proofErr w:type="gramEnd"/>
+      <w:r>
+        <w:t xml:space="preserve"> bread in the park</w:t>
+      </w:r>
+      <w:r>
+        <w:t xml:space="preserve">. </w:t>
+      </w:r>
+      <w:r>
+        <w:t xml:space="preserve">From her appearance, you might assume that </w:t>
+      </w:r>
+      <w:proofErr w:type="spellStart"/>
+      <w:r>
+        <w:t>Mr</w:t>
+      </w:r>
+      <w:proofErr w:type="spellEnd"/>
+      <w:r>
+        <w:t xml:space="preserve"> </w:t>
+      </w:r>
+      <w:proofErr w:type="spellStart"/>
+      <w:r>
+        <w:t>Petaloudes</w:t>
+      </w:r>
+      <w:proofErr w:type="spellEnd"/>
+      <w:r>
+        <w:t xml:space="preserve"> was alone. But he wasn’t. </w:t>
+      </w:r>
+    </w:p>
+    <w:p>
+      <w:r>
+        <w:t>She had a family. S</w:t>
+      </w:r>
+      <w:r>
+        <w:t xml:space="preserve">he had a </w:t>
+      </w:r>
+      <w:proofErr w:type="gramStart"/>
+      <w:r>
+        <w:t>daughter,</w:t>
+      </w:r>
+      <w:proofErr w:type="gramEnd"/>
+      <w:r>
+        <w:t xml:space="preserve"> and grandchildre</w:t>
+      </w:r>
+      <w:r>
+        <w:t>n</w:t>
+      </w:r>
+      <w:r>
+        <w:t>.</w:t>
+      </w:r>
+      <w:r>
+        <w:t xml:space="preserve"> She just didn’t like them very much and</w:t>
+      </w:r>
+      <w:r>
+        <w:t xml:space="preserve"> preferred the company of ducks</w:t>
+      </w:r>
+      <w:r>
+        <w:t xml:space="preserve">. </w:t>
+      </w:r>
+      <w:proofErr w:type="gramStart"/>
+      <w:r>
+        <w:t>Also</w:t>
+      </w:r>
+      <w:proofErr w:type="gramEnd"/>
+      <w:r>
+        <w:t xml:space="preserve"> homicidal Canadian </w:t>
+      </w:r>
+      <w:r>
+        <w:t>g</w:t>
+      </w:r>
+      <w:r>
+        <w:t xml:space="preserve">eese and pigeons.  </w:t>
+      </w:r>
+      <w:r>
+        <w:t>I</w:t>
+      </w:r>
+      <w:r>
+        <w:t>t had been mentioned to her</w:t>
+      </w:r>
+      <w:r>
+        <w:t xml:space="preserve"> by her son-in-law</w:t>
+      </w:r>
+      <w:r>
+        <w:t xml:space="preserve"> that if she fed birds grain in the street, rather than ducks bread in the park, it would require another</w:t>
+      </w:r>
+      <w:r>
+        <w:t>, different,</w:t>
+      </w:r>
+      <w:r>
+        <w:t xml:space="preserve"> antisocial </w:t>
+      </w:r>
+      <w:proofErr w:type="spellStart"/>
+      <w:r>
+        <w:t>behaviour</w:t>
+      </w:r>
+      <w:proofErr w:type="spellEnd"/>
+      <w:r>
+        <w:t xml:space="preserve"> order </w:t>
+      </w:r>
+      <w:r>
+        <w:t xml:space="preserve">to stop her. </w:t>
+      </w:r>
+      <w:r>
+        <w:t xml:space="preserve">The street didn’t have as many bylaws as the park. </w:t>
+      </w:r>
+      <w:proofErr w:type="gramStart"/>
+      <w:r>
+        <w:t>So</w:t>
+      </w:r>
+      <w:proofErr w:type="gramEnd"/>
+      <w:r>
+        <w:t xml:space="preserve"> s</w:t>
+      </w:r>
+      <w:r>
+        <w:t>he might not have as much legal trouble. And by the time the local neighborhood watch got around to</w:t>
+      </w:r>
+      <w:r>
+        <w:t xml:space="preserve"> deciding the best thing they could do was continue to hound </w:t>
+      </w:r>
+      <w:proofErr w:type="spellStart"/>
+      <w:r>
+        <w:t>Mrs</w:t>
+      </w:r>
+      <w:proofErr w:type="spellEnd"/>
+      <w:r>
+        <w:t xml:space="preserve"> Petaloudes</w:t>
+      </w:r>
+      <w:r>
+        <w:t xml:space="preserve">, there’d been a change of government and locking up your </w:t>
+      </w:r>
+      <w:proofErr w:type="spellStart"/>
+      <w:r>
+        <w:t>neighbours</w:t>
+      </w:r>
+      <w:proofErr w:type="spellEnd"/>
+      <w:r>
+        <w:t xml:space="preserve"> for being mildly annoying had gone out of fashion</w:t>
+      </w:r>
+      <w:r>
+        <w:t>.</w:t>
+      </w:r>
+      <w:r>
+        <w:t xml:space="preserve"> </w:t>
+      </w:r>
+      <w:r>
+        <w:t>D</w:t>
+      </w:r>
+      <w:r>
+        <w:t>estroy</w:t>
+      </w:r>
+      <w:r>
+        <w:t>ing your own</w:t>
+      </w:r>
+      <w:r>
+        <w:t xml:space="preserve"> country because our bananas weren’t the right </w:t>
+      </w:r>
+      <w:proofErr w:type="gramStart"/>
+      <w:r>
+        <w:t>shape</w:t>
+      </w:r>
+      <w:proofErr w:type="gramEnd"/>
+      <w:r>
+        <w:t xml:space="preserve"> </w:t>
+      </w:r>
+      <w:r>
+        <w:t xml:space="preserve">more </w:t>
+      </w:r>
+      <w:r>
+        <w:t xml:space="preserve">the rage. </w:t>
+      </w:r>
+    </w:p>
+    <w:p>
+      <w:r>
+        <w:t>Something like that.</w:t>
+      </w:r>
+    </w:p>
+    <w:p>
+      <w:r>
+        <w:lastRenderedPageBreak/>
+        <w:t xml:space="preserve">He was watching his own house. From across the street. He was </w:t>
+      </w:r>
+      <w:proofErr w:type="gramStart"/>
+      <w:r>
+        <w:t>actually watching</w:t>
+      </w:r>
+      <w:proofErr w:type="gramEnd"/>
+      <w:r>
+        <w:t xml:space="preserve"> it from behind a </w:t>
+      </w:r>
+      <w:proofErr w:type="spellStart"/>
+      <w:r>
+        <w:t>rhododrendron</w:t>
+      </w:r>
+      <w:proofErr w:type="spellEnd"/>
+      <w:r>
+        <w:t xml:space="preserve"> in the garden of a house that looked like it was abandoned. </w:t>
+      </w:r>
+    </w:p>
+    <w:p>
+      <w:r>
+        <w:t xml:space="preserve">Would they be watching his house? He guessed if they were going to come after him, they probably would be. But were they coming after him? All that dancing in the street he’d done, smashing his phone and buying a new one, was that </w:t>
+      </w:r>
+      <w:proofErr w:type="gramStart"/>
+      <w:r>
+        <w:t>really necessary</w:t>
+      </w:r>
+      <w:proofErr w:type="gramEnd"/>
+      <w:r>
+        <w:t>?</w:t>
+      </w:r>
+      <w:r>
+        <w:t xml:space="preserve"> Was </w:t>
+      </w:r>
+      <w:proofErr w:type="gramStart"/>
+      <w:r>
+        <w:t>he being</w:t>
+      </w:r>
+      <w:proofErr w:type="gramEnd"/>
+      <w:r>
+        <w:t xml:space="preserve"> paranoid? Was he overreacting?</w:t>
+      </w:r>
+      <w:r>
+        <w:br/>
+      </w:r>
+      <w:r>
+        <w:br/>
+        <w:t>They’d killed Jackie. He was certain of that.</w:t>
+      </w:r>
+    </w:p>
+    <w:p>
+      <w:r>
+        <w:t xml:space="preserve">He watched </w:t>
+      </w:r>
+      <w:proofErr w:type="spellStart"/>
+      <w:r>
+        <w:t>Mr</w:t>
       </w:r>
       <w:r>
         <w:t>s</w:t>
       </w:r>
-      <w:r>
-        <w:t xml:space="preserve"> letter box</w:t>
-      </w:r>
-      <w:r>
-        <w:t>.</w:t>
-      </w:r>
+      <w:proofErr w:type="spellEnd"/>
+      <w:r>
+        <w:t xml:space="preserve"> Petaloud</w:t>
+      </w:r>
+      <w:r>
+        <w:t>i</w:t>
+      </w:r>
+      <w:r>
+        <w:t>s</w:t>
+      </w:r>
+      <w:r>
+        <w:t xml:space="preserve"> as she waddled up the road, all in black, with a black headscarf, pulling her black shopping trolley behind her. She</w:t>
+      </w:r>
+      <w:r>
+        <w:t xml:space="preserve"> was followed by a flock of </w:t>
+      </w:r>
+      <w:proofErr w:type="gramStart"/>
+      <w:r>
+        <w:t xml:space="preserve">pigeons, </w:t>
+      </w:r>
+      <w:r>
+        <w:t xml:space="preserve"> two</w:t>
+      </w:r>
+      <w:proofErr w:type="gramEnd"/>
       <w:r>
         <w:t xml:space="preserve"> </w:t>
       </w:r>
       <w:r>
-        <w:t>She was in the same metaphorical</w:t>
-      </w:r>
-      <w:r>
-        <w:t>, legal.</w:t>
-      </w:r>
-      <w:r>
-        <w:t xml:space="preserve"> boat as</w:t>
-      </w:r>
-      <w:r>
-        <w:t xml:space="preserve"> the </w:t>
-      </w:r>
-      <w:r>
-        <w:t xml:space="preserve">youths who decided they wanted to play football in the street next to </w:t>
-      </w:r>
-      <w:r>
-        <w:t>his neighbour’s</w:t>
-      </w:r>
-      <w:r>
-        <w:t xml:space="preserve"> house</w:t>
-      </w:r>
-      <w:r>
-        <w:t>.</w:t>
+        <w:t>enormous seagulls, a</w:t>
+      </w:r>
+      <w:r>
+        <w:t>nd a</w:t>
+      </w:r>
+      <w:r>
+        <w:t xml:space="preserve"> few ducks that must have somehow got the message that she had taken her act on the road</w:t>
+      </w:r>
+      <w:r>
+        <w:t xml:space="preserve"> and away from the pond in the park</w:t>
+      </w:r>
+      <w:r>
+        <w:t xml:space="preserve">. </w:t>
+      </w:r>
+    </w:p>
+    <w:p>
+      <w:r>
+        <w:t xml:space="preserve">She reached a spot on the pavement </w:t>
+      </w:r>
+      <w:proofErr w:type="gramStart"/>
+      <w:r>
+        <w:t>where there</w:t>
+      </w:r>
+      <w:proofErr w:type="gramEnd"/>
+      <w:r>
+        <w:t xml:space="preserve"> parked cars </w:t>
+      </w:r>
+      <w:proofErr w:type="gramStart"/>
+      <w:r>
+        <w:t>cleared</w:t>
+      </w:r>
+      <w:proofErr w:type="gramEnd"/>
+      <w:r>
+        <w:t xml:space="preserve"> because there were two driveways next to each other. </w:t>
+      </w:r>
+      <w:r>
+        <w:t xml:space="preserve">Sitting out on the drive – for the </w:t>
+      </w:r>
+      <w:proofErr w:type="spellStart"/>
+      <w:r>
+        <w:t>pidgeons</w:t>
+      </w:r>
+      <w:proofErr w:type="spellEnd"/>
+      <w:r>
+        <w:t xml:space="preserve"> to poo on</w:t>
+      </w:r>
+      <w:r>
+        <w:t xml:space="preserve"> -</w:t>
+      </w:r>
+      <w:r>
+        <w:t xml:space="preserve"> was </w:t>
+      </w:r>
+      <w:r>
+        <w:t xml:space="preserve">the </w:t>
+      </w:r>
+      <w:proofErr w:type="spellStart"/>
+      <w:r>
+        <w:t>Pendeli</w:t>
+      </w:r>
+      <w:proofErr w:type="spellEnd"/>
+      <w:r>
+        <w:t xml:space="preserve"> PX 432, </w:t>
+      </w:r>
+      <w:r>
+        <w:t xml:space="preserve">Klee’s </w:t>
+      </w:r>
+      <w:proofErr w:type="spellStart"/>
+      <w:r>
+        <w:t>neighbour’s</w:t>
+      </w:r>
+      <w:proofErr w:type="spellEnd"/>
+      <w:r>
+        <w:t xml:space="preserve"> nearly</w:t>
       </w:r>
       <w:r>
         <w:t xml:space="preserve"> </w:t>
       </w:r>
       <w:r>
-        <w:t>His neighbour</w:t>
-      </w:r>
-      <w:r>
-        <w:t xml:space="preserve"> whose car was so expensive he’d had to broker his own insurance deal on the Lloyd</w:t>
-      </w:r>
-      <w:r>
-        <w:t>’</w:t>
-      </w:r>
-      <w:r>
-        <w:t xml:space="preserve">s markets. </w:t>
-      </w:r>
-      <w:r>
-        <w:t>The man naked with cat food, the boys playing football and the lady in black who fed the birds, a</w:t>
-      </w:r>
-      <w:r>
-        <w:t>ll</w:t>
-      </w:r>
-      <w:r>
-        <w:t xml:space="preserve"> of these</w:t>
-      </w:r>
-      <w:r>
-        <w:t xml:space="preserve"> terrible</w:t>
-      </w:r>
-      <w:r>
-        <w:t xml:space="preserve"> threats to society had got the same anti-social behaviour orders. </w:t>
-      </w:r>
-      <w:r>
-        <w:t>Orders telling them to stop it.</w:t>
+        <w:t xml:space="preserve">uninsurable supercar. </w:t>
       </w:r>
       <w:r>
         <w:t xml:space="preserve"> </w:t>
       </w:r>
       <w:r>
-        <w:t>So Mrs Petalou</w:t>
-      </w:r>
-      <w:r>
-        <w:t>d</w:t>
-      </w:r>
-      <w:r>
-        <w:t>es, actually it was probably her son</w:t>
-      </w:r>
-      <w:r>
-        <w:t>-</w:t>
-      </w:r>
-      <w:r>
-        <w:t>in</w:t>
-      </w:r>
-      <w:r>
-        <w:t>-</w:t>
-      </w:r>
-      <w:r>
-        <w:t>law</w:t>
-      </w:r>
-      <w:r>
-        <w:t xml:space="preserve"> had stopped</w:t>
-      </w:r>
-      <w:r>
-        <w:t xml:space="preserve"> her</w:t>
-      </w:r>
-      <w:r>
-        <w:t xml:space="preserve"> feed</w:t>
-      </w:r>
-      <w:r>
-        <w:t>ing</w:t>
-      </w:r>
-      <w:r>
-        <w:t xml:space="preserve"> birds bread in the park</w:t>
-      </w:r>
-      <w:r>
-        <w:t>.</w:t>
-      </w:r>
-      <w:r>
-        <w:t xml:space="preserve"> Yes, she wasn’t alone</w:t>
-      </w:r>
-      <w:r>
-        <w:t xml:space="preserve"> she had a daughter, and grandchildred. S</w:t>
-      </w:r>
-      <w:r>
-        <w:t xml:space="preserve">he just preferred the company of ducks, homicidal Canadian </w:t>
-      </w:r>
-      <w:r>
-        <w:t>Geese</w:t>
-      </w:r>
-      <w:r>
-        <w:t xml:space="preserve"> and pigeons</w:t>
-      </w:r>
-      <w:r>
-        <w:t xml:space="preserve"> to her own family</w:t>
-      </w:r>
-      <w:r>
-        <w:t xml:space="preserve">.  </w:t>
-      </w:r>
-      <w:r>
-        <w:t>I</w:t>
-      </w:r>
-      <w:r>
-        <w:t>t</w:t>
-      </w:r>
-      <w:r>
-        <w:t xml:space="preserve"> had been mentioned to her</w:t>
-      </w:r>
-      <w:r>
-        <w:t xml:space="preserve"> by her son-in-law</w:t>
-      </w:r>
-      <w:r>
-        <w:t xml:space="preserve"> that if she fed birds grain in the street, rather than ducks bread in the park, it would require another</w:t>
-      </w:r>
-      <w:r>
-        <w:t>, different,</w:t>
-      </w:r>
-      <w:r>
-        <w:t xml:space="preserve"> antisocial behaviour order </w:t>
-      </w:r>
-      <w:r>
-        <w:t>to stop her. Because</w:t>
-      </w:r>
-      <w:r>
-        <w:t xml:space="preserve"> the street</w:t>
-      </w:r>
-      <w:r>
-        <w:t>,</w:t>
-      </w:r>
-      <w:r>
-        <w:t xml:space="preserve"> not having as many bylaws as the park, she might not have as much legal trouble. And by the time the local </w:t>
-      </w:r>
-      <w:r>
-        <w:t>neighborhood</w:t>
-      </w:r>
-      <w:r>
-        <w:t xml:space="preserve"> watch got around to that, there’d been a change of government and locking up your neighbours for being mildly annoying had gone out of fashion and </w:t>
-      </w:r>
-      <w:r>
-        <w:t>destroy</w:t>
-      </w:r>
-      <w:r>
-        <w:t>ing your own</w:t>
-      </w:r>
-      <w:r>
-        <w:t xml:space="preserve"> country because our bananas weren’t the right shape was all the rage. </w:t>
-      </w:r>
-    </w:p>
-    <w:p>
-      <w:r>
-        <w:t>Something like that.</w:t>
-      </w:r>
-    </w:p>
-    <w:p>
-      <w:r>
-        <w:t xml:space="preserve">He was watching his own house. From across the street. He was actually watching it from behind a </w:t>
-      </w:r>
-      <w:r>
-        <w:t>rhododrendron</w:t>
-      </w:r>
-      <w:r>
-        <w:t xml:space="preserve"> in the garden of a house that looked like it was abandoned. </w:t>
-      </w:r>
-    </w:p>
-    <w:p>
-      <w:r>
-        <w:t>Would they be watching his house? He guessed if they were going to come after him, they probably would be. But were they coming after him? All that dancing in the street he’d done, smashing his phone and buying a new one, was that really necessary?</w:t>
-      </w:r>
-    </w:p>
-    <w:p>
-      <w:r>
-        <w:lastRenderedPageBreak/>
-        <w:t>Mr</w:t>
-      </w:r>
-      <w:r>
-        <w:t xml:space="preserve"> Petaloudes was followed by a flock of pigeons, </w:t>
-      </w:r>
-      <w:r>
-        <w:t xml:space="preserve"> two </w:t>
-      </w:r>
-      <w:r>
-        <w:t>enormous seagulls, a</w:t>
-      </w:r>
-      <w:r>
-        <w:t>nd a</w:t>
-      </w:r>
-      <w:r>
-        <w:t xml:space="preserve"> few ducks that must have somehow got the message that she had taken her act on the road</w:t>
-      </w:r>
-      <w:r>
-        <w:t xml:space="preserve"> and away from the pond in the park</w:t>
-      </w:r>
-      <w:r>
-        <w:t>.</w:t>
-      </w:r>
-      <w:r>
-        <w:t xml:space="preserve"> She waddled, head down along the pavement, clad entirely in black</w:t>
-      </w:r>
-      <w:r>
-        <w:t xml:space="preserve"> with a</w:t>
-      </w:r>
-      <w:r>
-        <w:t xml:space="preserve"> black headscarf dragging her black shopping cart behind her. She reached a spot on the pavement where </w:t>
-      </w:r>
-      <w:r>
-        <w:t>there</w:t>
-      </w:r>
-      <w:r>
-        <w:t xml:space="preserve"> parked cars cleared because there were two driveways next to each other. </w:t>
-      </w:r>
-      <w:r>
-        <w:t>Sitting out on the drive – for the pidgeons to poo on</w:t>
-      </w:r>
-      <w:r>
-        <w:t xml:space="preserve"> -</w:t>
-      </w:r>
-      <w:r>
-        <w:t xml:space="preserve"> was </w:t>
-      </w:r>
-      <w:r>
-        <w:t xml:space="preserve">the Pendeli PX 432, </w:t>
-      </w:r>
-      <w:r>
-        <w:t>Klee’s neighbour’s nearly</w:t>
+        <w:t>And next to that, over a low wall w</w:t>
+      </w:r>
+      <w:r>
+        <w:t xml:space="preserve">as Klee’s car – </w:t>
+      </w:r>
+      <w:r>
+        <w:t>a</w:t>
+      </w:r>
+      <w:r>
+        <w:t xml:space="preserve"> VBMS – </w:t>
+      </w:r>
+      <w:r>
+        <w:t>a</w:t>
+      </w:r>
+      <w:r>
+        <w:t xml:space="preserve"> Very Boring Mid-</w:t>
+      </w:r>
+      <w:r>
+        <w:t>R</w:t>
+      </w:r>
+      <w:r>
+        <w:t xml:space="preserve">ange Saloon. </w:t>
+      </w:r>
+    </w:p>
+    <w:p>
+      <w:r>
+        <w:t>When he needed a car, h</w:t>
+      </w:r>
+      <w:r>
+        <w:t xml:space="preserve">e always went to his </w:t>
+      </w:r>
+      <w:proofErr w:type="spellStart"/>
+      <w:r>
+        <w:t>favourite</w:t>
+      </w:r>
+      <w:proofErr w:type="spellEnd"/>
+      <w:r>
+        <w:t xml:space="preserve"> second-hand car dealer, Div Patel. And asked him for the most boring car that he had.</w:t>
+      </w:r>
+    </w:p>
+    <w:p>
+      <w:r>
+        <w:t xml:space="preserve">Klee wished for a moment that he could just go and sit in his kitchen and have a cup of tea. </w:t>
+      </w:r>
+      <w:r>
+        <w:t>Out the back of Klee’s house was a garden. By some amazing stroke of luck, it was a garden that he could see better than anyone else</w:t>
+      </w:r>
+      <w:r>
+        <w:t xml:space="preserve"> even though it wasn’t his</w:t>
+      </w:r>
+      <w:r>
+        <w:t>!</w:t>
       </w:r>
       <w:r>
         <w:t xml:space="preserve"> </w:t>
       </w:r>
       <w:r>
-        <w:t xml:space="preserve">uninsurable supercar. </w:t>
-      </w:r>
+        <w:t>It was a brilliant arrangement – he could look it at, but he didn’t have to garden it.</w:t>
+      </w:r>
+    </w:p>
+    <w:p>
+      <w:r>
+        <w:t>There was a large bush, nearly a tree, which he didn’t notice much for the rest of the year, but which in the autumn was covered in red berries.</w:t>
+      </w:r>
+      <w:r>
+        <w:t xml:space="preserve"> At some specific point, these berries must</w:t>
+      </w:r>
+      <w:r>
+        <w:t xml:space="preserve"> get</w:t>
+      </w:r>
+      <w:r>
+        <w:t xml:space="preserve"> ripe, and when the</w:t>
+      </w:r>
+      <w:r>
+        <w:t xml:space="preserve">y </w:t>
+      </w:r>
+      <w:r>
+        <w:t>did</w:t>
+      </w:r>
+      <w:r>
+        <w:t>, the bush w</w:t>
+      </w:r>
+      <w:r>
+        <w:t>ould</w:t>
+      </w:r>
+      <w:r>
+        <w:t xml:space="preserve"> suddenly </w:t>
+      </w:r>
+      <w:r>
+        <w:t xml:space="preserve">be </w:t>
+      </w:r>
+      <w:r>
+        <w:t xml:space="preserve">covered in pigeons. But not ordinary pigeons, big, fat wood pigeons. </w:t>
+      </w:r>
+      <w:r>
+        <w:t xml:space="preserve">There </w:t>
+      </w:r>
+      <w:proofErr w:type="gramStart"/>
+      <w:r>
+        <w:t>weren’t</w:t>
+      </w:r>
+      <w:proofErr w:type="gramEnd"/>
+      <w:r>
+        <w:t xml:space="preserve"> the cockney, </w:t>
+      </w:r>
+      <w:r>
+        <w:t>Trafalgar square bad boys</w:t>
+      </w:r>
+      <w:r>
+        <w:t xml:space="preserve">. </w:t>
+      </w:r>
+      <w:r>
+        <w:t xml:space="preserve">These </w:t>
+      </w:r>
+      <w:proofErr w:type="gramStart"/>
+      <w:r>
+        <w:t>were</w:t>
+      </w:r>
+      <w:proofErr w:type="gramEnd"/>
       <w:r>
         <w:t xml:space="preserve"> </w:t>
       </w:r>
       <w:r>
-        <w:t>And next to that, over a low wall w</w:t>
-      </w:r>
-      <w:r>
-        <w:t xml:space="preserve">as Klee’s car – </w:t>
-      </w:r>
-      <w:r>
-        <w:t>a</w:t>
-      </w:r>
-      <w:r>
-        <w:t xml:space="preserve"> VBMS – </w:t>
-      </w:r>
-      <w:r>
-        <w:t>a</w:t>
-      </w:r>
-      <w:r>
-        <w:t xml:space="preserve"> Very Boring Mid-range Saloon. He always went to his favourite second-hand car dealer, Div Patel. And asked him for the most boring car that he had.</w:t>
-      </w:r>
-    </w:p>
-    <w:p>
-      <w:r>
-        <w:t xml:space="preserve">Klee wished for a moment that he could just go and sit in his kitchen and have a cup of tea. </w:t>
-      </w:r>
-      <w:r>
-        <w:t>Out the back of Klee’s house was a garden. By some amazing stroke of luck, it was a garden that he could see better than anyone else</w:t>
-      </w:r>
-      <w:r>
-        <w:t xml:space="preserve"> even though it wasn’t his</w:t>
-      </w:r>
-      <w:r>
-        <w:t>!</w:t>
-      </w:r>
-      <w:r>
-        <w:t xml:space="preserve"> </w:t>
-      </w:r>
-      <w:r>
-        <w:t>It was a brilliant arrangement – he could look it at, but he didn’t have to garden it.</w:t>
-      </w:r>
-    </w:p>
-    <w:p>
-      <w:r>
-        <w:t>There was a large bush, nearly a tree, which he didn’t notice much for the rest of the year, but which in the autumn was covered in red berries.</w:t>
-      </w:r>
-      <w:r>
-        <w:t xml:space="preserve"> At some specific point, these berries must be ripe, and when the</w:t>
-      </w:r>
-      <w:r>
-        <w:t xml:space="preserve">y </w:t>
-      </w:r>
-      <w:r>
-        <w:t>were, the bush w</w:t>
-      </w:r>
-      <w:r>
-        <w:t>as</w:t>
-      </w:r>
-      <w:r>
-        <w:t xml:space="preserve"> suddenly covered in pigeons. But not ordinary pigeons, big, fat wood pigeons. </w:t>
-      </w:r>
-      <w:r>
-        <w:t>Not the</w:t>
-      </w:r>
-      <w:r>
-        <w:t xml:space="preserve"> Trafalgar </w:t>
-      </w:r>
-      <w:r>
-        <w:t>square</w:t>
-      </w:r>
-      <w:r>
-        <w:t xml:space="preserve"> bad boys</w:t>
-      </w:r>
-      <w:r>
-        <w:t>. Wood pigeons were</w:t>
+        <w:t>Wood pigeons were</w:t>
       </w:r>
       <w:r>
         <w:t xml:space="preserve"> their</w:t>
       </w:r>
       <w:r>
-        <w:t xml:space="preserve"> lardier and most slow-moving bigger cousins.</w:t>
+        <w:t xml:space="preserve"> lardier and </w:t>
+      </w:r>
+      <w:proofErr w:type="gramStart"/>
+      <w:r>
+        <w:t>most slow</w:t>
+      </w:r>
+      <w:proofErr w:type="gramEnd"/>
+      <w:r>
+        <w:t>-moving bigger cousins.</w:t>
       </w:r>
       <w:r>
         <w:br/>
@@ -452,278 +802,472 @@
         <w:t>“</w:t>
       </w:r>
       <w:r>
-        <w:t>Which point hadn’t been tricky</w:t>
-      </w:r>
+        <w:t>Which point hadn’t been tricky?</w:t>
+      </w:r>
+      <w:r>
+        <w:t>”</w:t>
+      </w:r>
+      <w:r>
+        <w:t xml:space="preserve"> He could hear his wife saying sharply. Well, </w:t>
+      </w:r>
+      <w:r>
+        <w:t>this</w:t>
+      </w:r>
+      <w:r>
+        <w:t xml:space="preserve"> tricky</w:t>
+      </w:r>
+      <w:r>
+        <w:t xml:space="preserve"> point </w:t>
+      </w:r>
+      <w:r>
+        <w:t xml:space="preserve">of the many tricky points </w:t>
+      </w:r>
+      <w:r>
+        <w:t>had been when he was</w:t>
+      </w:r>
+      <w:r>
+        <w:t xml:space="preserve"> suspended, looking like he was going to be fired without his pension</w:t>
+      </w:r>
+      <w:r>
+        <w:t>. In a career of points</w:t>
+      </w:r>
+      <w:r>
+        <w:t xml:space="preserve"> that </w:t>
+      </w:r>
+      <w:r>
+        <w:t xml:space="preserve">had been less than </w:t>
+      </w:r>
+      <w:proofErr w:type="spellStart"/>
+      <w:r>
+        <w:t>marvellous</w:t>
+      </w:r>
+      <w:proofErr w:type="spellEnd"/>
+      <w:r>
+        <w:t>,</w:t>
+      </w:r>
+      <w:r>
+        <w:t xml:space="preserve"> that hadn’t been a great </w:t>
+      </w:r>
+      <w:r>
+        <w:t>one</w:t>
+      </w:r>
+      <w:r>
+        <w:t xml:space="preserve">. At that point, he’d often sat at his kitchen table and looked out over the garden. And that autumn he’d watched the </w:t>
+      </w:r>
+      <w:r>
+        <w:t xml:space="preserve">wood </w:t>
+      </w:r>
+      <w:r>
+        <w:t>pigeons. Often</w:t>
+      </w:r>
+      <w:r>
+        <w:t>,</w:t>
+      </w:r>
+      <w:r>
+        <w:t xml:space="preserve"> he’d watched them with Jackie, who would could round whenever he got the chance.</w:t>
+      </w:r>
+    </w:p>
+    <w:p>
+      <w:r>
+        <w:lastRenderedPageBreak/>
+        <w:t>Somebody at a party had asked him once what his soul animal would be</w:t>
+      </w:r>
+      <w:r>
+        <w:t xml:space="preserve">. Not used to being the one on the business end of an interrogation, and then mostly being used to being asked where the hell his accent came from, and so, slightly surprised, </w:t>
+      </w:r>
+      <w:r>
+        <w:t xml:space="preserve">he’d said “wood pigeon.” Almost without thinking. Maybe it was just the thought of being able to eat enormous amounts without getting any grief </w:t>
+      </w:r>
+      <w:proofErr w:type="gramStart"/>
+      <w:r>
+        <w:t>for</w:t>
+      </w:r>
+      <w:proofErr w:type="gramEnd"/>
+      <w:r>
+        <w:t xml:space="preserve"> it. He also, for some reason, quite liked the idea of swaying around upside down, eating the cotoneaster berries.</w:t>
+      </w:r>
+      <w:r>
+        <w:t xml:space="preserve"> The reason he was thinking about this now was that there were also wood pigeons in </w:t>
+      </w:r>
+      <w:proofErr w:type="spellStart"/>
+      <w:r>
+        <w:t>Mrs</w:t>
+      </w:r>
+      <w:proofErr w:type="spellEnd"/>
+      <w:r>
+        <w:t xml:space="preserve"> </w:t>
+      </w:r>
+      <w:proofErr w:type="spellStart"/>
+      <w:r>
+        <w:t>Petaloudes</w:t>
+      </w:r>
+      <w:proofErr w:type="spellEnd"/>
+      <w:r>
+        <w:t xml:space="preserve"> retinue.</w:t>
+      </w:r>
+      <w:r>
+        <w:t xml:space="preserve"> Not getting to the grains as fast as the other pigeons, getting pushed out of the way by the seagulls. Discretely avoiding the ducks, but</w:t>
+      </w:r>
+      <w:r>
+        <w:t xml:space="preserve"> moving through the crowd </w:t>
+      </w:r>
+      <w:proofErr w:type="spellStart"/>
+      <w:r>
+        <w:t>quitely</w:t>
+      </w:r>
+      <w:proofErr w:type="spellEnd"/>
+      <w:r>
+        <w:t xml:space="preserve"> quietly, still getting fed.</w:t>
+      </w:r>
+    </w:p>
+    <w:p>
+      <w:proofErr w:type="spellStart"/>
+      <w:r>
+        <w:t>Mrs</w:t>
+      </w:r>
+      <w:proofErr w:type="spellEnd"/>
+      <w:r>
+        <w:t xml:space="preserve"> </w:t>
+      </w:r>
+      <w:proofErr w:type="spellStart"/>
+      <w:r>
+        <w:t>Petaouldes</w:t>
+      </w:r>
+      <w:proofErr w:type="spellEnd"/>
+      <w:r>
+        <w:t xml:space="preserve"> delved deep into her shopping trolley and in a single movement</w:t>
+      </w:r>
+      <w:r>
+        <w:t xml:space="preserve">, like the </w:t>
+      </w:r>
+      <w:proofErr w:type="spellStart"/>
+      <w:r>
+        <w:t>sower</w:t>
+      </w:r>
+      <w:proofErr w:type="spellEnd"/>
+      <w:r>
+        <w:t xml:space="preserve"> in the parable of </w:t>
+      </w:r>
+      <w:r>
+        <w:t xml:space="preserve">the </w:t>
+      </w:r>
+      <w:proofErr w:type="spellStart"/>
+      <w:r>
+        <w:t>sower</w:t>
+      </w:r>
+      <w:proofErr w:type="spellEnd"/>
+      <w:r>
+        <w:t>,</w:t>
+      </w:r>
+      <w:r>
+        <w:t xml:space="preserve"> she spread wheat and </w:t>
+      </w:r>
+      <w:r>
+        <w:t xml:space="preserve">dried </w:t>
+      </w:r>
+      <w:r>
+        <w:t>sweetcorn</w:t>
+      </w:r>
+      <w:r>
+        <w:t xml:space="preserve"> – acceptable fodder for the </w:t>
+      </w:r>
+      <w:proofErr w:type="spellStart"/>
+      <w:r>
+        <w:t>gastroentrinal</w:t>
+      </w:r>
+      <w:proofErr w:type="spellEnd"/>
+      <w:r>
+        <w:t xml:space="preserve"> tract of a duck </w:t>
+      </w:r>
+      <w:proofErr w:type="gramStart"/>
+      <w:r>
+        <w:t xml:space="preserve">- </w:t>
+      </w:r>
+      <w:r>
+        <w:t xml:space="preserve"> grains</w:t>
+      </w:r>
+      <w:proofErr w:type="gramEnd"/>
+      <w:r>
+        <w:t xml:space="preserve"> across the bonnet of his car, and his </w:t>
+      </w:r>
+      <w:proofErr w:type="spellStart"/>
+      <w:r>
+        <w:t>neighbour</w:t>
+      </w:r>
+      <w:r>
+        <w:t>’</w:t>
+      </w:r>
+      <w:r>
+        <w:t>s</w:t>
+      </w:r>
+      <w:proofErr w:type="spellEnd"/>
+      <w:r>
+        <w:t xml:space="preserve"> super car.</w:t>
+      </w:r>
+      <w:r>
+        <w:t xml:space="preserve"> She spread the grain in a giant arc. The parabola of the </w:t>
+      </w:r>
+      <w:proofErr w:type="spellStart"/>
+      <w:proofErr w:type="gramStart"/>
+      <w:r>
+        <w:t>sower</w:t>
+      </w:r>
+      <w:proofErr w:type="spellEnd"/>
+      <w:proofErr w:type="gramEnd"/>
       <w:r>
         <w:t>?</w:t>
       </w:r>
-      <w:r>
-        <w:t>”</w:t>
-      </w:r>
-      <w:r>
-        <w:t xml:space="preserve"> He could hear his wife saying sharply</w:t>
-      </w:r>
-      <w:r>
-        <w:t xml:space="preserve">. </w:t>
-      </w:r>
-      <w:r>
-        <w:t xml:space="preserve">Well, </w:t>
-      </w:r>
-      <w:r>
-        <w:t>this</w:t>
-      </w:r>
-      <w:r>
-        <w:t xml:space="preserve"> tricky</w:t>
-      </w:r>
-      <w:r>
-        <w:t xml:space="preserve"> point </w:t>
-      </w:r>
-      <w:r>
-        <w:t xml:space="preserve">of the many tricky points </w:t>
-      </w:r>
-      <w:r>
-        <w:t>had been when he was</w:t>
-      </w:r>
-      <w:r>
-        <w:t xml:space="preserve"> suspended, looking like </w:t>
-      </w:r>
-      <w:r>
-        <w:t>he was</w:t>
-      </w:r>
-      <w:r>
-        <w:t xml:space="preserve"> going to be fired without </w:t>
-      </w:r>
-      <w:r>
-        <w:t>his</w:t>
-      </w:r>
-      <w:r>
-        <w:t xml:space="preserve"> pension</w:t>
-      </w:r>
-      <w:r>
-        <w:t>. In a career of points</w:t>
-      </w:r>
-      <w:r>
-        <w:t xml:space="preserve"> that </w:t>
-      </w:r>
-      <w:r>
-        <w:t>had been less than marvellous,</w:t>
-      </w:r>
-      <w:r>
-        <w:t xml:space="preserve"> that hadn’t been</w:t>
-      </w:r>
-      <w:r>
-        <w:t xml:space="preserve"> a </w:t>
-      </w:r>
-      <w:r>
-        <w:t>great</w:t>
-      </w:r>
-      <w:r>
-        <w:t xml:space="preserve"> point</w:t>
+    </w:p>
+    <w:p>
+      <w:r>
+        <w:t xml:space="preserve">Lots of grain and lots of pigeons were landing on the bonnet of his </w:t>
+      </w:r>
+      <w:proofErr w:type="spellStart"/>
+      <w:r>
+        <w:t>neighbour’s</w:t>
+      </w:r>
+      <w:proofErr w:type="spellEnd"/>
+      <w:r>
+        <w:t xml:space="preserve"> car. </w:t>
+      </w:r>
+      <w:r>
+        <w:t>A few wood pigeons landed on the bonnet of</w:t>
+      </w:r>
+      <w:r>
+        <w:t xml:space="preserve"> BMR</w:t>
+      </w:r>
+      <w:r>
+        <w:t xml:space="preserve">. Somehow making it to this </w:t>
+      </w:r>
+      <w:proofErr w:type="gramStart"/>
+      <w:r>
+        <w:t>particular round</w:t>
+      </w:r>
+      <w:proofErr w:type="gramEnd"/>
+      <w:r>
+        <w:t xml:space="preserve"> of grain before any of the others in the mixed company of fowls.</w:t>
+      </w:r>
+    </w:p>
+    <w:p>
+      <w:r>
+        <w:t>Klee was starting to think that this was stupid. His flat wasn’t being watched</w:t>
+      </w:r>
+      <w:r>
+        <w:t>!</w:t>
+      </w:r>
+      <w:r>
+        <w:t xml:space="preserve"> He could go in and make himself a cup of tea.</w:t>
+      </w:r>
+      <w:r>
+        <w:t xml:space="preserve"> Say hello to </w:t>
+      </w:r>
+      <w:proofErr w:type="spellStart"/>
+      <w:r>
+        <w:t>Mrs</w:t>
+      </w:r>
+      <w:proofErr w:type="spellEnd"/>
+      <w:r>
+        <w:t xml:space="preserve"> Petaloudis on the way in.</w:t>
+      </w:r>
+      <w:r>
+        <w:t xml:space="preserve"> He didn’t need to be hiding behind this rhododendron. Then the two wood </w:t>
+      </w:r>
+      <w:proofErr w:type="gramStart"/>
+      <w:r>
+        <w:t>pigeons</w:t>
+      </w:r>
+      <w:proofErr w:type="gramEnd"/>
+      <w:r>
+        <w:t xml:space="preserve"> the ones that he thought might be</w:t>
+      </w:r>
+      <w:r>
+        <w:t xml:space="preserve"> his soul animal, </w:t>
+      </w:r>
+      <w:proofErr w:type="spellStart"/>
+      <w:r>
+        <w:t>evapourated</w:t>
+      </w:r>
+      <w:proofErr w:type="spellEnd"/>
+      <w:r>
+        <w:t xml:space="preserve"> and</w:t>
+      </w:r>
+      <w:r>
+        <w:t xml:space="preserve"> </w:t>
+      </w:r>
+      <w:r>
+        <w:t>his car exploded.</w:t>
+      </w:r>
+    </w:p>
+    <w:p>
+      <w:r>
+        <w:t xml:space="preserve"> </w:t>
+      </w:r>
+      <w:r>
+        <w:t>----------------</w:t>
+      </w:r>
+    </w:p>
+    <w:p>
+      <w:r>
+        <w:t xml:space="preserve">This was </w:t>
+      </w:r>
+      <w:r>
+        <w:t xml:space="preserve">a </w:t>
+      </w:r>
+      <w:r>
+        <w:t xml:space="preserve">big bomb. </w:t>
+      </w:r>
+      <w:r>
+        <w:t>And it had bewildering</w:t>
+      </w:r>
+      <w:r>
+        <w:t xml:space="preserve">ly </w:t>
+      </w:r>
+      <w:proofErr w:type="spellStart"/>
+      <w:r>
+        <w:t>condradictory</w:t>
+      </w:r>
+      <w:proofErr w:type="spellEnd"/>
+      <w:r>
+        <w:t xml:space="preserve"> effects. For </w:t>
+      </w:r>
+      <w:proofErr w:type="spellStart"/>
+      <w:r>
+        <w:t>Mrs</w:t>
+      </w:r>
+      <w:proofErr w:type="spellEnd"/>
+      <w:r>
+        <w:t xml:space="preserve"> Petaloudes, the effect was like she’d been, not so much fired out of a cannon, but bowled, like a bowling ball across the road.</w:t>
+      </w:r>
+      <w:r>
+        <w:t xml:space="preserve"> She had happened to be bending over her trolley with her back to the blast.</w:t>
+      </w:r>
+      <w:r>
+        <w:t xml:space="preserve"> </w:t>
+      </w:r>
+      <w:r>
+        <w:t xml:space="preserve">And had ended up, yes, covered in a </w:t>
+      </w:r>
+      <w:proofErr w:type="gramStart"/>
+      <w:r>
+        <w:t>little bit</w:t>
+      </w:r>
+      <w:r>
+        <w:t>s</w:t>
+      </w:r>
+      <w:proofErr w:type="gramEnd"/>
+      <w:r>
+        <w:t xml:space="preserve"> of leaf </w:t>
+      </w:r>
+      <w:proofErr w:type="spellStart"/>
+      <w:r>
+        <w:t>mould</w:t>
+      </w:r>
+      <w:proofErr w:type="spellEnd"/>
+      <w:r>
+        <w:t xml:space="preserve"> and debris for the gutter, but otherwise unscathed. She was </w:t>
+      </w:r>
+      <w:r>
+        <w:t>sitting</w:t>
+      </w:r>
+      <w:r>
+        <w:t xml:space="preserve">, </w:t>
+      </w:r>
+      <w:proofErr w:type="gramStart"/>
+      <w:r>
+        <w:t>blinking</w:t>
+      </w:r>
+      <w:proofErr w:type="gramEnd"/>
+      <w:r>
+        <w:t xml:space="preserve"> facing away from the explosion.</w:t>
+      </w:r>
+      <w:r>
+        <w:t xml:space="preserve"> The effect for Klee, who </w:t>
+      </w:r>
+      <w:proofErr w:type="gramStart"/>
+      <w:r>
+        <w:t>had been further away was</w:t>
+      </w:r>
+      <w:proofErr w:type="gramEnd"/>
+      <w:r>
+        <w:t xml:space="preserve"> to</w:t>
+      </w:r>
+      <w:r>
+        <w:t xml:space="preserve"> be</w:t>
+      </w:r>
+      <w:r>
+        <w:t xml:space="preserve"> suck</w:t>
+      </w:r>
+      <w:r>
+        <w:t>ed</w:t>
+      </w:r>
+      <w:r>
+        <w:t xml:space="preserve"> in</w:t>
+      </w:r>
+      <w:r>
+        <w:t xml:space="preserve"> towards the blast</w:t>
+      </w:r>
+      <w:r>
+        <w:t xml:space="preserve"> which </w:t>
+      </w:r>
+      <w:r>
+        <w:t>pull</w:t>
+      </w:r>
+      <w:r>
+        <w:t>ed</w:t>
+      </w:r>
+      <w:r>
+        <w:t xml:space="preserve"> him through the rhododendron bush that he was hiding behind</w:t>
+      </w:r>
+      <w:r>
+        <w:t>. He was left upside down on the pavement in front of her</w:t>
       </w:r>
       <w:r>
         <w:t>.</w:t>
       </w:r>
-      <w:r>
-        <w:t xml:space="preserve"> At that point, he’d often sat at his kitchen</w:t>
-      </w:r>
+    </w:p>
+    <w:p>
+      <w:r>
+        <w:t>Klee had never said much to her, before, perhaps the odd “hello.”</w:t>
+      </w:r>
+    </w:p>
+    <w:p>
+      <w:r>
+        <w:t>He could see that she was still conscious. She didn’t look like she was too badly hurt?</w:t>
+      </w:r>
+      <w:r>
+        <w:br/>
+        <w:t>“Are you alright</w:t>
+      </w:r>
+      <w:proofErr w:type="gramStart"/>
+      <w:r>
+        <w:t>?</w:t>
+      </w:r>
+      <w:proofErr w:type="gramEnd"/>
       <w:r>
         <w:t xml:space="preserve"> </w:t>
       </w:r>
-      <w:r>
-        <w:t xml:space="preserve">table and looked out over the garden. And that autumn he’d watched the </w:t>
-      </w:r>
-      <w:r>
-        <w:t xml:space="preserve">wood </w:t>
-      </w:r>
-      <w:r>
-        <w:t>pigeons. Often</w:t>
-      </w:r>
-      <w:r>
-        <w:t>,</w:t>
-      </w:r>
-      <w:r>
-        <w:t xml:space="preserve"> he’d watched them with Jackie, who would </w:t>
-      </w:r>
-      <w:r>
-        <w:t>could</w:t>
-      </w:r>
-      <w:r>
-        <w:t xml:space="preserve"> round whenever he got the chance.</w:t>
-      </w:r>
-    </w:p>
-    <w:p>
-      <w:r>
-        <w:t>Somebody at a party had asked him once what his soul animal would be</w:t>
-      </w:r>
-      <w:r>
-        <w:t xml:space="preserve">. Not used to being the one on the business end of an interrogation, and then mostly being used to being asked where the hell his accent came from, and so, slightly surprised, </w:t>
-      </w:r>
-      <w:r>
-        <w:t>he’d said “wood pigeon.” Almost without thinking. Maybe it was just the thought of being able to eat enormous amounts without getting any grief for it. He also, for some reason, quite liked the idea of swaying around upside down, eating the cotoneaster berries.</w:t>
-      </w:r>
-      <w:r>
-        <w:t xml:space="preserve"> The reason he was thinking about this now was that there were also wood pigeons in Mrs Petaloudes retinue.</w:t>
-      </w:r>
-      <w:r>
-        <w:t xml:space="preserve"> Not getting to the grains as fast as the other pigeons, getting pushed out of the way by the seagulls. Discretely avoiding the ducks, but quietly, still getting fed.</w:t>
-      </w:r>
-    </w:p>
-    <w:p>
-      <w:r>
-        <w:t xml:space="preserve">Mrs </w:t>
-      </w:r>
-      <w:r>
-        <w:t>Petaouldes</w:t>
-      </w:r>
-      <w:r>
-        <w:t xml:space="preserve"> delved deep into her shopping trolley and in a single movement</w:t>
-      </w:r>
-      <w:r>
-        <w:t>, like the sower in the parable of the sower</w:t>
-      </w:r>
-      <w:r>
-        <w:t xml:space="preserve"> she spread wheat and </w:t>
-      </w:r>
-      <w:r>
-        <w:t xml:space="preserve">dried </w:t>
-      </w:r>
-      <w:r>
-        <w:t xml:space="preserve">sweetcorn grains across </w:t>
-      </w:r>
-      <w:r>
-        <w:lastRenderedPageBreak/>
-        <w:t xml:space="preserve">the bonnet of his car, and his </w:t>
-      </w:r>
-      <w:r>
-        <w:t>neighbour</w:t>
-      </w:r>
-      <w:r>
-        <w:t>’</w:t>
-      </w:r>
-      <w:r>
-        <w:t>s</w:t>
-      </w:r>
-      <w:r>
-        <w:t xml:space="preserve"> super car.</w:t>
-      </w:r>
-      <w:r>
-        <w:t xml:space="preserve"> She spread the grain in a giant arc. The parabola of the sower?</w:t>
-      </w:r>
-    </w:p>
-    <w:p>
-      <w:r>
-        <w:t>A few wood pigeons landed on the bonnet of his car. Somehow making it to this particular round of grain before any of the others in the mixed company of fowls.</w:t>
-      </w:r>
-    </w:p>
-    <w:p>
-      <w:r>
-        <w:t xml:space="preserve">Klee was starting to think that this was stupid. His flat wasn’t being watched. He could go in and make himself a cup of tea. He didn’t need to be hiding behind this rhododendron. Then the two wood pigeons, his soul animals, evapourated </w:t>
-      </w:r>
-      <w:r>
-        <w:t>his car exploded.</w:t>
-      </w:r>
-    </w:p>
-    <w:p>
-      <w:r>
-        <w:t xml:space="preserve"> </w:t>
-      </w:r>
-      <w:r>
-        <w:t>----------------</w:t>
-      </w:r>
-    </w:p>
-    <w:p>
-      <w:r>
-        <w:t xml:space="preserve">This was </w:t>
-      </w:r>
-      <w:r>
-        <w:t xml:space="preserve">a </w:t>
-      </w:r>
-      <w:r>
-        <w:t xml:space="preserve">big bomb. </w:t>
-      </w:r>
-      <w:r>
-        <w:t>And it had bewildering</w:t>
-      </w:r>
-      <w:r>
-        <w:t>ly condradictory</w:t>
-      </w:r>
-      <w:r>
-        <w:t xml:space="preserve"> effects. For Mrs Petaloudes, the effect was like she’d been, not so much fired out of a cannon, but bowled, like a bowling ball across the road.</w:t>
-      </w:r>
-      <w:r>
-        <w:t xml:space="preserve"> She had happened to be bending over her trolley with her back to the blast.</w:t>
-      </w:r>
-      <w:r>
-        <w:t xml:space="preserve"> </w:t>
-      </w:r>
-      <w:r>
-        <w:t xml:space="preserve">And had ended up, yes, covered in a little bit of leaf mould and debris for the gutter, but otherwise unscathed. She was </w:t>
-      </w:r>
-      <w:r>
-        <w:t>sitting</w:t>
-      </w:r>
-      <w:r>
-        <w:t>, blinking</w:t>
-      </w:r>
-      <w:r>
-        <w:t xml:space="preserve"> facing away from the explosion.</w:t>
-      </w:r>
-      <w:r>
-        <w:t xml:space="preserve"> The effect for Klee, who had been further away was to</w:t>
-      </w:r>
-      <w:r>
-        <w:t xml:space="preserve"> be</w:t>
-      </w:r>
-      <w:r>
-        <w:t xml:space="preserve"> suck</w:t>
-      </w:r>
-      <w:r>
-        <w:t>ed</w:t>
-      </w:r>
-      <w:r>
-        <w:t xml:space="preserve"> in</w:t>
-      </w:r>
-      <w:r>
-        <w:t xml:space="preserve"> towards the blast</w:t>
-      </w:r>
-      <w:r>
-        <w:t xml:space="preserve"> which </w:t>
-      </w:r>
-      <w:r>
-        <w:t>pull</w:t>
-      </w:r>
-      <w:r>
-        <w:t>ed</w:t>
-      </w:r>
-      <w:r>
-        <w:t xml:space="preserve"> him through the rhododendron bush that he was hiding behind</w:t>
-      </w:r>
-      <w:r>
-        <w:t>. He was left upside down on the pavement in front of her</w:t>
-      </w:r>
+      <w:proofErr w:type="spellStart"/>
+      <w:r>
+        <w:t>Mrs</w:t>
+      </w:r>
+      <w:proofErr w:type="spellEnd"/>
+      <w:r>
+        <w:t xml:space="preserve"> Petaloudes?”</w:t>
+      </w:r>
+      <w:r>
+        <w:t xml:space="preserve"> He tried to say as he righted himself.</w:t>
+      </w:r>
+      <w:r>
+        <w:br/>
+        <w:t>“I’m allowed to feed them here</w:t>
+      </w:r>
+      <w:proofErr w:type="gramStart"/>
       <w:r>
         <w:t>.</w:t>
       </w:r>
-    </w:p>
-    <w:p>
-      <w:r>
-        <w:t>Klee had never said much to her, before, perhaps the odd “hello.”</w:t>
-      </w:r>
-    </w:p>
-    <w:p>
-      <w:r>
-        <w:t>He could see that she was still conscious. She didn’t look like she was too badly hurt?</w:t>
-      </w:r>
-      <w:r>
-        <w:br/>
-        <w:t>“Are you alright? Mrs Petaloudes?”</w:t>
-      </w:r>
-      <w:r>
-        <w:t xml:space="preserve"> He tried to say as he righted himself.</w:t>
-      </w:r>
-      <w:r>
-        <w:br/>
-        <w:t>“I’m allowed to feed them here. There’s nothing you can do copper!”</w:t>
+      <w:proofErr w:type="gramEnd"/>
+      <w:r>
+        <w:t xml:space="preserve"> There’s nothing you can do copper!”</w:t>
       </w:r>
       <w:r>
         <w:br/>
@@ -733,22 +1277,48 @@
         <w:t>?</w:t>
       </w:r>
       <w:r>
+        <w:t xml:space="preserve"> A former policeman.</w:t>
+      </w:r>
+      <w:r>
         <w:t xml:space="preserve"> </w:t>
       </w:r>
       <w:r>
         <w:t>H</w:t>
       </w:r>
       <w:r>
-        <w:t xml:space="preserve">e supposed everybody probably made it their business to know if their neighbour was a policeman. </w:t>
-      </w:r>
-    </w:p>
-    <w:p>
-      <w:r>
-        <w:t>“I’m not a police office anymore Mrs Petaloudes.”</w:t>
-      </w:r>
-    </w:p>
-    <w:p>
-      <w:r>
+        <w:t xml:space="preserve">e supposed everybody probably made it their business to know if their </w:t>
+      </w:r>
+      <w:proofErr w:type="spellStart"/>
+      <w:r>
+        <w:t>neighbour</w:t>
+      </w:r>
+      <w:proofErr w:type="spellEnd"/>
+      <w:r>
+        <w:t xml:space="preserve"> was a policeman. </w:t>
+      </w:r>
+    </w:p>
+    <w:p>
+      <w:r>
+        <w:t>“I’m not a police office</w:t>
+      </w:r>
+      <w:r>
+        <w:t>r</w:t>
+      </w:r>
+      <w:r>
+        <w:t xml:space="preserve"> anymore </w:t>
+      </w:r>
+      <w:proofErr w:type="spellStart"/>
+      <w:r>
+        <w:t>Mrs</w:t>
+      </w:r>
+      <w:proofErr w:type="spellEnd"/>
+      <w:r>
+        <w:t xml:space="preserve"> Petaloudes.”</w:t>
+      </w:r>
+    </w:p>
+    <w:p>
+      <w:r>
+        <w:lastRenderedPageBreak/>
         <w:t>“Well, then leave me alone!”</w:t>
       </w:r>
     </w:p>
@@ -760,7 +1330,26 @@
         <w:t>,</w:t>
       </w:r>
       <w:r>
-        <w:t xml:space="preserve"> to his surprise, that she didn’t feel weak or frail, but actually quite solid.</w:t>
+        <w:t xml:space="preserve"> to his surprise, that she didn’t feel weak or frail, but </w:t>
+      </w:r>
+      <w:proofErr w:type="gramStart"/>
+      <w:r>
+        <w:t>actually quite</w:t>
+      </w:r>
+      <w:proofErr w:type="gramEnd"/>
+      <w:r>
+        <w:t xml:space="preserve"> solid.</w:t>
+      </w:r>
+      <w:r>
+        <w:t xml:space="preserve"> Lithe even. Did </w:t>
+      </w:r>
+      <w:proofErr w:type="spellStart"/>
+      <w:r>
+        <w:t>Mrs</w:t>
+      </w:r>
+      <w:proofErr w:type="spellEnd"/>
+      <w:r>
+        <w:t xml:space="preserve"> Peatloudis work out?</w:t>
       </w:r>
       <w:r>
         <w:t xml:space="preserve"> </w:t>
@@ -769,7 +1358,15 @@
         <w:t>H</w:t>
       </w:r>
       <w:r>
-        <w:t xml:space="preserve">e wondered how old she was. But looking her directly in the face always seemed to be a struggle. He caught just a glance of her pale brown eyes. </w:t>
+        <w:t xml:space="preserve">e wondered how old she was. But </w:t>
+      </w:r>
+      <w:proofErr w:type="gramStart"/>
+      <w:r>
+        <w:t>looking</w:t>
+      </w:r>
+      <w:proofErr w:type="gramEnd"/>
+      <w:r>
+        <w:t xml:space="preserve"> her directly in the face always seemed to be a struggle. He caught just a glance of her pale brown eyes. </w:t>
       </w:r>
     </w:p>
     <w:p>
@@ -787,17 +1384,37 @@
     </w:p>
     <w:p>
       <w:r>
-        <w:t xml:space="preserve">When they’d bought the house, one of the things that the estate agent had made much of, was the off-street parking. </w:t>
-      </w:r>
-      <w:r>
-        <w:t xml:space="preserve">The patch of gravel in front of the house. Klee could now </w:t>
-      </w:r>
-      <w:r>
-        <w:lastRenderedPageBreak/>
-        <w:t>see that the bomb had turned this off-street parking into on-roof parking – he could see at least one wheel up there. It had also managed to put the engine block of his grey-blue mid-range saloon on the bonnet of his neighbour’s car.</w:t>
-      </w:r>
-      <w:r>
-        <w:t xml:space="preserve"> And it had put out all of the windows.</w:t>
+        <w:t xml:space="preserve">When </w:t>
+      </w:r>
+      <w:proofErr w:type="gramStart"/>
+      <w:r>
+        <w:t>they’d</w:t>
+      </w:r>
+      <w:proofErr w:type="gramEnd"/>
+      <w:r>
+        <w:t xml:space="preserve"> bought the house, one of the things that the estate agent had made much of, was the off-street parking. </w:t>
+      </w:r>
+      <w:r>
+        <w:t xml:space="preserve">The patch of gravel in front of the house. Klee could now see that the bomb had turned this off-street parking into on-roof parking – he could see at least one wheel up there. It had also managed to put the engine block of his grey-blue mid-range saloon on the bonnet of his </w:t>
+      </w:r>
+      <w:proofErr w:type="spellStart"/>
+      <w:r>
+        <w:t>neighbour’s</w:t>
+      </w:r>
+      <w:proofErr w:type="spellEnd"/>
+      <w:r>
+        <w:t xml:space="preserve"> car.</w:t>
+      </w:r>
+      <w:r>
+        <w:t xml:space="preserve"> And it had put out </w:t>
+      </w:r>
+      <w:proofErr w:type="gramStart"/>
+      <w:r>
+        <w:t>all of</w:t>
+      </w:r>
+      <w:proofErr w:type="gramEnd"/>
+      <w:r>
+        <w:t xml:space="preserve"> the windows.</w:t>
       </w:r>
     </w:p>
     <w:p/>

</xml_diff>